<commit_message>
Slides and code first official draft.
</commit_message>
<xml_diff>
--- a/Outline/IntroToHPCWorkshopOutline.docx
+++ b/Outline/IntroToHPCWorkshopOutline.docx
@@ -1,6 +1,6 @@
 
 <file path=word/document.xml><?xml version="1.0" encoding="utf-8"?>
-<w:document xmlns:wpc="http://schemas.microsoft.com/office/word/2010/wordprocessingCanvas" xmlns:cx="http://schemas.microsoft.com/office/drawing/2014/chartex" xmlns:cx1="http://schemas.microsoft.com/office/drawing/2015/9/8/chartex" xmlns:cx2="http://schemas.microsoft.com/office/drawing/2015/10/21/chartex" xmlns:cx3="http://schemas.microsoft.com/office/drawing/2016/5/9/chartex" xmlns:cx4="http://schemas.microsoft.com/office/drawing/2016/5/10/chartex" xmlns:cx5="http://schemas.microsoft.com/office/drawing/2016/5/11/chartex" xmlns:cx6="http://schemas.microsoft.com/office/drawing/2016/5/12/chartex" xmlns:cx7="http://schemas.microsoft.com/office/drawing/2016/5/13/chartex" xmlns:cx8="http://schemas.microsoft.com/office/drawing/2016/5/14/chartex" xmlns:mc="http://schemas.openxmlformats.org/markup-compatibility/2006" xmlns:aink="http://schemas.microsoft.com/office/drawing/2016/ink" xmlns:am3d="http://schemas.microsoft.com/office/drawing/2017/model3d" xmlns:o="urn:schemas-microsoft-com:office:office" xmlns:oel="http://schemas.microsoft.com/office/2019/extlst" xmlns:r="http://schemas.openxmlformats.org/officeDocument/2006/relationships" xmlns:m="http://schemas.openxmlformats.org/officeDocument/2006/math" xmlns:v="urn:schemas-microsoft-com:vml" xmlns:wp14="http://schemas.microsoft.com/office/word/2010/wordprocessingDrawing" xmlns:wp="http://schemas.openxmlformats.org/drawingml/2006/wordprocessingDrawing" xmlns:w10="urn:schemas-microsoft-com:office:word" xmlns:w="http://schemas.openxmlformats.org/wordprocessingml/2006/main" xmlns:w14="http://schemas.microsoft.com/office/word/2010/wordml" xmlns:w15="http://schemas.microsoft.com/office/word/2012/wordml" xmlns:w16cex="http://schemas.microsoft.com/office/word/2018/wordml/cex" xmlns:w16cid="http://schemas.microsoft.com/office/word/2016/wordml/cid" xmlns:w16="http://schemas.microsoft.com/office/word/2018/wordml" xmlns:w16sdtdh="http://schemas.microsoft.com/office/word/2020/wordml/sdtdatahash" xmlns:w16se="http://schemas.microsoft.com/office/word/2015/wordml/symex" xmlns:wpg="http://schemas.microsoft.com/office/word/2010/wordprocessingGroup" xmlns:wpi="http://schemas.microsoft.com/office/word/2010/wordprocessingInk" xmlns:wne="http://schemas.microsoft.com/office/word/2006/wordml" xmlns:wps="http://schemas.microsoft.com/office/word/2010/wordprocessingShape" mc:Ignorable="w14 w15 w16se w16cid w16 w16cex w16sdtdh wp14">
+<w:document xmlns:wpc="http://schemas.microsoft.com/office/word/2010/wordprocessingCanvas" xmlns:cx="http://schemas.microsoft.com/office/drawing/2014/chartex" xmlns:cx1="http://schemas.microsoft.com/office/drawing/2015/9/8/chartex" xmlns:cx2="http://schemas.microsoft.com/office/drawing/2015/10/21/chartex" xmlns:cx3="http://schemas.microsoft.com/office/drawing/2016/5/9/chartex" xmlns:cx4="http://schemas.microsoft.com/office/drawing/2016/5/10/chartex" xmlns:cx5="http://schemas.microsoft.com/office/drawing/2016/5/11/chartex" xmlns:cx6="http://schemas.microsoft.com/office/drawing/2016/5/12/chartex" xmlns:cx7="http://schemas.microsoft.com/office/drawing/2016/5/13/chartex" xmlns:cx8="http://schemas.microsoft.com/office/drawing/2016/5/14/chartex" xmlns:mc="http://schemas.openxmlformats.org/markup-compatibility/2006" xmlns:aink="http://schemas.microsoft.com/office/drawing/2016/ink" xmlns:am3d="http://schemas.microsoft.com/office/drawing/2017/model3d" xmlns:o="urn:schemas-microsoft-com:office:office" xmlns:oel="http://schemas.microsoft.com/office/2019/extlst" xmlns:r="http://schemas.openxmlformats.org/officeDocument/2006/relationships" xmlns:m="http://schemas.openxmlformats.org/officeDocument/2006/math" xmlns:v="urn:schemas-microsoft-com:vml" xmlns:wp14="http://schemas.microsoft.com/office/word/2010/wordprocessingDrawing" xmlns:wp="http://schemas.openxmlformats.org/drawingml/2006/wordprocessingDrawing" xmlns:w10="urn:schemas-microsoft-com:office:word" xmlns:w="http://schemas.openxmlformats.org/wordprocessingml/2006/main" xmlns:w14="http://schemas.microsoft.com/office/word/2010/wordml" xmlns:w15="http://schemas.microsoft.com/office/word/2012/wordml" xmlns:w16cex="http://schemas.microsoft.com/office/word/2018/wordml/cex" xmlns:w16cid="http://schemas.microsoft.com/office/word/2016/wordml/cid" xmlns:w16="http://schemas.microsoft.com/office/word/2018/wordml" xmlns:w16du="http://schemas.microsoft.com/office/word/2023/wordml/word16du" xmlns:w16sdtdh="http://schemas.microsoft.com/office/word/2020/wordml/sdtdatahash" xmlns:w16sdtfl="http://schemas.microsoft.com/office/word/2024/wordml/sdtformatlock" xmlns:w16se="http://schemas.microsoft.com/office/word/2015/wordml/symex" xmlns:wpg="http://schemas.microsoft.com/office/word/2010/wordprocessingGroup" xmlns:wpi="http://schemas.microsoft.com/office/word/2010/wordprocessingInk" xmlns:wne="http://schemas.microsoft.com/office/word/2006/wordml" xmlns:wps="http://schemas.microsoft.com/office/word/2010/wordprocessingShape" mc:Ignorable="w14 w15 w16se w16cid w16 w16cex w16sdtdh w16sdtfl w16du wp14">
   <w:body>
     <w:p>
       <w:pPr>
@@ -16,7 +16,6 @@
           <w:b/>
           <w:sz w:val="30"/>
           <w:szCs w:val="30"/>
-          <w:lang w:val="en-CA"/>
         </w:rPr>
       </w:pPr>
       <w:r>
@@ -25,19 +24,8 @@
           <w:b/>
           <w:sz w:val="28"/>
           <w:szCs w:val="28"/>
-          <w:lang w:val="en-CA"/>
-        </w:rPr>
-        <w:t xml:space="preserve">Workshop </w:t>
-      </w:r>
-      <w:r>
-        <w:rPr>
-          <w:rFonts w:eastAsia="Calibri"/>
-          <w:b/>
-          <w:sz w:val="28"/>
-          <w:szCs w:val="28"/>
-          <w:lang w:val="en-CA"/>
-        </w:rPr>
-        <w:t>Title</w:t>
+        </w:rPr>
+        <w:t>Intro To High-performance Computing</w:t>
       </w:r>
       <w:r>
         <w:rPr>
@@ -45,7 +33,6 @@
           <w:b/>
           <w:sz w:val="30"/>
           <w:szCs w:val="30"/>
-          <w:lang w:val="en-CA"/>
         </w:rPr>
         <w:br/>
       </w:r>
@@ -55,15 +42,13 @@
         <w:spacing w:after="200" w:line="360" w:lineRule="auto"/>
         <w:rPr>
           <w:rFonts w:eastAsia="Calibri"/>
-          <w:lang w:val="en-CA"/>
-        </w:rPr>
-      </w:pPr>
-      <w:r>
-        <w:rPr>
-          <w:rFonts w:eastAsia="Calibri"/>
-          <w:b/>
-          <w:bCs/>
-          <w:lang w:val="en-CA"/>
+        </w:rPr>
+      </w:pPr>
+      <w:r>
+        <w:rPr>
+          <w:rFonts w:eastAsia="Calibri"/>
+          <w:b/>
+          <w:bCs/>
         </w:rPr>
         <w:t>Workshop Lead</w:t>
       </w:r>
@@ -72,10 +57,15 @@
           <w:rFonts w:eastAsia="Calibri"/>
           <w:b/>
           <w:bCs/>
-          <w:lang w:val="en-CA"/>
         </w:rPr>
         <w:t xml:space="preserve">: </w:t>
       </w:r>
+      <w:r>
+        <w:rPr>
+          <w:rFonts w:eastAsia="Calibri"/>
+        </w:rPr>
+        <w:t>Megan Ng</w:t>
+      </w:r>
     </w:p>
     <w:p>
       <w:pPr>
@@ -83,17 +73,15 @@
         <w:rPr>
           <w:rFonts w:eastAsia="Calibri"/>
           <w:highlight w:val="white"/>
-          <w:lang w:val="en-CA"/>
-        </w:rPr>
-      </w:pPr>
-      <w:r>
-        <w:rPr>
-          <w:rFonts w:eastAsia="Calibri"/>
-          <w:b/>
-          <w:bCs/>
-          <w:lang w:val="en-CA"/>
-        </w:rPr>
-        <w:t>Registration link: NA</w:t>
+        </w:rPr>
+      </w:pPr>
+      <w:r>
+        <w:rPr>
+          <w:rFonts w:eastAsia="Calibri"/>
+          <w:b/>
+          <w:bCs/>
+        </w:rPr>
+        <w:t xml:space="preserve">Registration link: </w:t>
       </w:r>
     </w:p>
     <w:p>
@@ -101,37 +89,37 @@
         <w:spacing w:after="200" w:line="360" w:lineRule="auto"/>
         <w:rPr>
           <w:rFonts w:eastAsia="Calibri"/>
-          <w:b/>
-          <w:bCs/>
-          <w:lang w:val="en-CA"/>
-        </w:rPr>
-      </w:pPr>
-      <w:r>
-        <w:rPr>
-          <w:rFonts w:eastAsia="Calibri"/>
-          <w:b/>
-          <w:bCs/>
-          <w:lang w:val="en-CA"/>
-        </w:rPr>
-        <w:t>Approximate duration: 4 hours</w:t>
-      </w:r>
-    </w:p>
-    <w:p>
-      <w:pPr>
-        <w:spacing w:line="360" w:lineRule="auto"/>
-        <w:rPr>
-          <w:rFonts w:eastAsia="Calibri"/>
-          <w:b/>
-          <w:bCs/>
-          <w:lang w:val="en-CA"/>
-        </w:rPr>
-      </w:pPr>
-      <w:r>
-        <w:rPr>
-          <w:rFonts w:eastAsia="Calibri"/>
-          <w:b/>
-          <w:bCs/>
-          <w:lang w:val="en-CA"/>
+        </w:rPr>
+      </w:pPr>
+      <w:r>
+        <w:rPr>
+          <w:rFonts w:eastAsia="Calibri"/>
+          <w:b/>
+          <w:bCs/>
+        </w:rPr>
+        <w:t xml:space="preserve">Approximate duration: </w:t>
+      </w:r>
+      <w:r>
+        <w:rPr>
+          <w:rFonts w:eastAsia="Calibri"/>
+        </w:rPr>
+        <w:t>2 hours</w:t>
+      </w:r>
+    </w:p>
+    <w:p>
+      <w:pPr>
+        <w:spacing w:line="360" w:lineRule="auto"/>
+        <w:rPr>
+          <w:rFonts w:eastAsia="Calibri"/>
+          <w:b/>
+          <w:bCs/>
+        </w:rPr>
+      </w:pPr>
+      <w:r>
+        <w:rPr>
+          <w:rFonts w:eastAsia="Calibri"/>
+          <w:b/>
+          <w:bCs/>
         </w:rPr>
         <w:t xml:space="preserve">Prerequisites: </w:t>
       </w:r>
@@ -148,9 +136,14 @@
           <w:rFonts w:eastAsia="Calibri"/>
           <w:b/>
           <w:bCs/>
-          <w:lang w:val="en-CA"/>
-        </w:rPr>
-      </w:pPr>
+        </w:rPr>
+      </w:pPr>
+      <w:r>
+        <w:rPr>
+          <w:rFonts w:eastAsia="Calibri"/>
+        </w:rPr>
+        <w:t>A Digital Research Alliance of Canada account</w:t>
+      </w:r>
     </w:p>
     <w:p>
       <w:pPr>
@@ -164,9 +157,29 @@
           <w:rFonts w:eastAsia="Calibri"/>
           <w:b/>
           <w:bCs/>
-          <w:lang w:val="en-CA"/>
-        </w:rPr>
-      </w:pPr>
+        </w:rPr>
+      </w:pPr>
+      <w:r>
+        <w:rPr>
+          <w:rFonts w:eastAsia="Calibri"/>
+        </w:rPr>
+        <w:t xml:space="preserve">The </w:t>
+      </w:r>
+      <w:hyperlink r:id="rId7" w:anchor="download-duo-mobile" w:history="1">
+        <w:r>
+          <w:rPr>
+            <w:rStyle w:val="Hyperlink"/>
+            <w:rFonts w:eastAsia="Calibri"/>
+          </w:rPr>
+          <w:t>Duo Mobile</w:t>
+        </w:r>
+      </w:hyperlink>
+      <w:r>
+        <w:rPr>
+          <w:rFonts w:eastAsia="Calibri"/>
+        </w:rPr>
+        <w:t xml:space="preserve"> application downloaded on your phone</w:t>
+      </w:r>
     </w:p>
     <w:p>
       <w:pPr>
@@ -178,11 +191,50 @@
         <w:spacing w:line="360" w:lineRule="auto"/>
         <w:rPr>
           <w:rFonts w:eastAsia="Calibri"/>
-          <w:b w:val="1"/>
-          <w:bCs w:val="1"/>
-          <w:lang w:val="en-CA"/>
-        </w:rPr>
-      </w:pPr>
+          <w:b/>
+          <w:bCs/>
+        </w:rPr>
+      </w:pPr>
+      <w:hyperlink r:id="rId8" w:history="1">
+        <w:r>
+          <w:rPr>
+            <w:rStyle w:val="Hyperlink"/>
+          </w:rPr>
+          <w:t>Globus Connect Personal</w:t>
+        </w:r>
+      </w:hyperlink>
+      <w:r>
+        <w:t xml:space="preserve"> software downloaded on your laptop</w:t>
+      </w:r>
+    </w:p>
+    <w:p>
+      <w:pPr>
+        <w:pStyle w:val="ListParagraph"/>
+        <w:numPr>
+          <w:ilvl w:val="0"/>
+          <w:numId w:val="4"/>
+        </w:numPr>
+        <w:spacing w:line="360" w:lineRule="auto"/>
+        <w:rPr>
+          <w:rFonts w:eastAsia="Calibri"/>
+          <w:b/>
+          <w:bCs/>
+        </w:rPr>
+      </w:pPr>
+      <w:r>
+        <w:t xml:space="preserve">A code editor (The workshop lead will be using </w:t>
+      </w:r>
+      <w:hyperlink r:id="rId9" w:history="1">
+        <w:r>
+          <w:rPr>
+            <w:rStyle w:val="Hyperlink"/>
+          </w:rPr>
+          <w:t>VS Code</w:t>
+        </w:r>
+      </w:hyperlink>
+      <w:r>
+        <w:t>)</w:t>
+      </w:r>
       <w:r>
         <w:br/>
       </w:r>
@@ -194,15 +246,13 @@
           <w:rFonts w:eastAsia="Calibri"/>
           <w:b/>
           <w:bCs/>
-          <w:lang w:val="en-CA"/>
-        </w:rPr>
-      </w:pPr>
-      <w:r>
-        <w:rPr>
-          <w:rFonts w:eastAsia="Calibri"/>
-          <w:b/>
-          <w:bCs/>
-          <w:lang w:val="en-CA"/>
+        </w:rPr>
+      </w:pPr>
+      <w:r>
+        <w:rPr>
+          <w:rFonts w:eastAsia="Calibri"/>
+          <w:b/>
+          <w:bCs/>
         </w:rPr>
         <w:t>Summary</w:t>
       </w:r>
@@ -211,7 +261,6 @@
           <w:rFonts w:eastAsia="Calibri"/>
           <w:b/>
           <w:bCs/>
-          <w:lang w:val="en-CA"/>
         </w:rPr>
         <w:t>:</w:t>
       </w:r>
@@ -220,18 +269,8 @@
           <w:rFonts w:eastAsia="Calibri"/>
           <w:b/>
           <w:bCs/>
-          <w:lang w:val="en-CA"/>
-        </w:rPr>
-        <w:t xml:space="preserve"> (2-3 sentence</w:t>
-      </w:r>
-      <w:r>
-        <w:rPr>
-          <w:rFonts w:eastAsia="Calibri"/>
-          <w:b/>
-          <w:bCs/>
-          <w:lang w:val="en-CA"/>
-        </w:rPr>
-        <w:t>s summarizing the workshop)</w:t>
+        </w:rPr>
+        <w:t xml:space="preserve"> </w:t>
       </w:r>
     </w:p>
     <w:p>
@@ -239,28 +278,103 @@
         <w:spacing w:after="200" w:line="263" w:lineRule="auto"/>
         <w:rPr>
           <w:rFonts w:eastAsia="Calibri"/>
-          <w:b/>
-          <w:bCs/>
-          <w:lang w:val="en-CA"/>
-        </w:rPr>
-      </w:pPr>
+        </w:rPr>
+      </w:pPr>
+      <w:r>
+        <w:rPr>
+          <w:rFonts w:eastAsia="Calibri"/>
+        </w:rPr>
+        <w:t xml:space="preserve">This workshop is designed to give </w:t>
+      </w:r>
+      <w:r>
+        <w:rPr>
+          <w:rFonts w:eastAsia="Calibri"/>
+        </w:rPr>
+        <w:t>you</w:t>
+      </w:r>
+      <w:r>
+        <w:rPr>
+          <w:rFonts w:eastAsia="Calibri"/>
+        </w:rPr>
+        <w:t xml:space="preserve"> </w:t>
+      </w:r>
+      <w:r>
+        <w:rPr>
+          <w:rFonts w:eastAsia="Calibri"/>
+        </w:rPr>
+        <w:t>practical experience using</w:t>
+      </w:r>
+      <w:r>
+        <w:rPr>
+          <w:rFonts w:eastAsia="Calibri"/>
+        </w:rPr>
+        <w:t xml:space="preserve"> the high-performance computing system offered by the</w:t>
+      </w:r>
+      <w:r>
+        <w:rPr>
+          <w:rFonts w:eastAsia="Calibri"/>
+        </w:rPr>
+        <w:t xml:space="preserve"> </w:t>
+      </w:r>
+      <w:r>
+        <w:rPr>
+          <w:rFonts w:eastAsia="Calibri"/>
+        </w:rPr>
+        <w:t>Digital Research Alliance of Canada</w:t>
+      </w:r>
+      <w:r>
+        <w:rPr>
+          <w:rFonts w:eastAsia="Calibri"/>
+        </w:rPr>
+        <w:t xml:space="preserve"> (DRAC)</w:t>
+      </w:r>
+      <w:r>
+        <w:rPr>
+          <w:rFonts w:eastAsia="Calibri"/>
+        </w:rPr>
+        <w:t>.</w:t>
+      </w:r>
+      <w:r>
+        <w:rPr>
+          <w:rFonts w:eastAsia="Calibri"/>
+        </w:rPr>
+        <w:t xml:space="preserve"> </w:t>
+      </w:r>
+      <w:r>
+        <w:rPr>
+          <w:rFonts w:eastAsia="Calibri"/>
+        </w:rPr>
+        <w:t>Through guided hands-on activities, you can expect to leave this workshop with the knowledge and skills required run your own computational experiments using DRAC start to finish – f</w:t>
+      </w:r>
+      <w:r>
+        <w:rPr>
+          <w:rFonts w:eastAsia="Calibri"/>
+        </w:rPr>
+        <w:t xml:space="preserve">rom organizing and uploading your data and code to submitting jobs, troubleshooting common errors, and optimizing your workflow for efficient computing. </w:t>
+      </w:r>
     </w:p>
     <w:p>
       <w:pPr>
         <w:spacing w:after="200" w:line="263" w:lineRule="auto"/>
         <w:rPr>
           <w:rFonts w:eastAsia="Calibri"/>
-          <w:b/>
-          <w:bCs/>
-          <w:lang w:val="en-CA"/>
-        </w:rPr>
-      </w:pPr>
-      <w:r>
-        <w:rPr>
-          <w:rFonts w:eastAsia="Calibri"/>
-          <w:b/>
-          <w:bCs/>
-          <w:lang w:val="en-CA"/>
+        </w:rPr>
+      </w:pPr>
+    </w:p>
+    <w:p>
+      <w:pPr>
+        <w:spacing w:after="200" w:line="263" w:lineRule="auto"/>
+        <w:rPr>
+          <w:rFonts w:eastAsia="Calibri"/>
+          <w:b/>
+          <w:bCs/>
+        </w:rPr>
+      </w:pPr>
+      <w:r>
+        <w:rPr>
+          <w:rFonts w:eastAsia="Calibri"/>
+          <w:b/>
+          <w:bCs/>
         </w:rPr>
         <w:t>Learning Objectives</w:t>
       </w:r>
@@ -269,27 +383,8 @@
           <w:rFonts w:eastAsia="Calibri"/>
           <w:b/>
           <w:bCs/>
-          <w:lang w:val="en-CA"/>
-        </w:rPr>
-        <w:t xml:space="preserve">: </w:t>
-      </w:r>
-      <w:r>
-        <w:rPr>
-          <w:rFonts w:eastAsia="Calibri"/>
-          <w:b/>
-          <w:bCs/>
-          <w:lang w:val="en-CA"/>
-        </w:rPr>
-        <w:t xml:space="preserve">(List 2-5 </w:t>
-      </w:r>
-      <w:r>
-        <w:rPr>
-          <w:rFonts w:eastAsia="Calibri"/>
-          <w:b/>
-          <w:bCs/>
-          <w:lang w:val="en-CA"/>
-        </w:rPr>
-        <w:t>learning objectives participants will learn upon completion of this workshop)</w:t>
+        </w:rPr>
+        <w:t>:</w:t>
       </w:r>
     </w:p>
     <w:p>
@@ -304,9 +399,32 @@
           <w:rFonts w:eastAsia="Calibri"/>
           <w:b/>
           <w:bCs/>
-          <w:lang w:val="en-CA"/>
-        </w:rPr>
-      </w:pPr>
+        </w:rPr>
+      </w:pPr>
+      <w:r>
+        <w:rPr>
+          <w:rFonts w:eastAsia="Calibri"/>
+        </w:rPr>
+        <w:t>Conceptually u</w:t>
+      </w:r>
+      <w:r>
+        <w:rPr>
+          <w:rFonts w:eastAsia="Calibri"/>
+        </w:rPr>
+        <w:t xml:space="preserve">nderstand the workflow of </w:t>
+      </w:r>
+      <w:r>
+        <w:rPr>
+          <w:rFonts w:eastAsia="Calibri"/>
+        </w:rPr>
+        <w:t xml:space="preserve">using </w:t>
+      </w:r>
+      <w:r>
+        <w:rPr>
+          <w:rFonts w:eastAsia="Calibri"/>
+        </w:rPr>
+        <w:t>DRAC</w:t>
+      </w:r>
     </w:p>
     <w:p>
       <w:pPr>
@@ -320,9 +438,95 @@
           <w:rFonts w:eastAsia="Calibri"/>
           <w:b/>
           <w:bCs/>
-          <w:lang w:val="en-CA"/>
-        </w:rPr>
-      </w:pPr>
+        </w:rPr>
+      </w:pPr>
+      <w:r>
+        <w:rPr>
+          <w:rFonts w:eastAsia="Calibri"/>
+        </w:rPr>
+        <w:t>Learn how to</w:t>
+      </w:r>
+      <w:r>
+        <w:rPr>
+          <w:rFonts w:eastAsia="Calibri"/>
+        </w:rPr>
+        <w:t xml:space="preserve"> </w:t>
+      </w:r>
+      <w:r>
+        <w:rPr>
+          <w:rFonts w:eastAsia="Calibri"/>
+        </w:rPr>
+        <w:t>use DRAC start to finish</w:t>
+      </w:r>
+      <w:r>
+        <w:rPr>
+          <w:rFonts w:eastAsia="Calibri"/>
+        </w:rPr>
+        <w:t xml:space="preserve"> </w:t>
+      </w:r>
+    </w:p>
+    <w:p>
+      <w:pPr>
+        <w:pStyle w:val="ListParagraph"/>
+        <w:numPr>
+          <w:ilvl w:val="1"/>
+          <w:numId w:val="5"/>
+        </w:numPr>
+        <w:spacing w:after="200" w:line="263" w:lineRule="auto"/>
+        <w:rPr>
+          <w:rFonts w:eastAsia="Calibri"/>
+        </w:rPr>
+      </w:pPr>
+      <w:r>
+        <w:rPr>
+          <w:rFonts w:eastAsia="Calibri"/>
+        </w:rPr>
+        <w:t xml:space="preserve">Uploading data and code to </w:t>
+      </w:r>
+      <w:r>
+        <w:rPr>
+          <w:rFonts w:eastAsia="Calibri"/>
+        </w:rPr>
+        <w:t>DRAC storage systems</w:t>
+      </w:r>
+    </w:p>
+    <w:p>
+      <w:pPr>
+        <w:pStyle w:val="ListParagraph"/>
+        <w:numPr>
+          <w:ilvl w:val="1"/>
+          <w:numId w:val="5"/>
+        </w:numPr>
+        <w:spacing w:after="200" w:line="263" w:lineRule="auto"/>
+        <w:rPr>
+          <w:rFonts w:eastAsia="Calibri"/>
+        </w:rPr>
+      </w:pPr>
+      <w:r>
+        <w:rPr>
+          <w:rFonts w:eastAsia="Calibri"/>
+        </w:rPr>
+        <w:t>Running code using DRAC high-performance computers</w:t>
+      </w:r>
+    </w:p>
+    <w:p>
+      <w:pPr>
+        <w:pStyle w:val="ListParagraph"/>
+        <w:numPr>
+          <w:ilvl w:val="1"/>
+          <w:numId w:val="5"/>
+        </w:numPr>
+        <w:spacing w:after="200" w:line="263" w:lineRule="auto"/>
+        <w:rPr>
+          <w:rFonts w:eastAsia="Calibri"/>
+        </w:rPr>
+      </w:pPr>
+      <w:r>
+        <w:rPr>
+          <w:rFonts w:eastAsia="Calibri"/>
+        </w:rPr>
+        <w:t>Retrieving and assessing results</w:t>
+      </w:r>
     </w:p>
     <w:p>
       <w:pPr>
@@ -336,9 +540,20 @@
           <w:rFonts w:eastAsia="Calibri"/>
           <w:b/>
           <w:bCs/>
-          <w:lang w:val="en-CA"/>
-        </w:rPr>
-      </w:pPr>
+        </w:rPr>
+      </w:pPr>
+      <w:r>
+        <w:rPr>
+          <w:rFonts w:eastAsia="Calibri"/>
+        </w:rPr>
+        <w:t xml:space="preserve">Identify and handle common errors that occur when using </w:t>
+      </w:r>
+      <w:r>
+        <w:rPr>
+          <w:rFonts w:eastAsia="Calibri"/>
+        </w:rPr>
+        <w:t>DRAC</w:t>
+      </w:r>
     </w:p>
     <w:p>
       <w:pPr>
@@ -352,23 +567,41 @@
           <w:rFonts w:eastAsia="Calibri"/>
           <w:b/>
           <w:bCs/>
-          <w:lang w:val="en-CA"/>
-        </w:rPr>
-      </w:pPr>
+        </w:rPr>
+      </w:pPr>
+      <w:r>
+        <w:rPr>
+          <w:rFonts w:eastAsia="Calibri"/>
+        </w:rPr>
+        <w:t>O</w:t>
+      </w:r>
+      <w:r>
+        <w:rPr>
+          <w:rFonts w:eastAsia="Calibri"/>
+        </w:rPr>
+        <w:t>ptimize local code for efficient use of</w:t>
+      </w:r>
+      <w:r>
+        <w:rPr>
+          <w:rFonts w:eastAsia="Calibri"/>
+        </w:rPr>
+        <w:t xml:space="preserve"> </w:t>
+      </w:r>
+      <w:r>
+        <w:rPr>
+          <w:rFonts w:eastAsia="Calibri"/>
+        </w:rPr>
+        <w:t>DRAC</w:t>
+      </w:r>
     </w:p>
     <w:p>
       <w:pPr>
         <w:pStyle w:val="ListParagraph"/>
-        <w:numPr>
-          <w:ilvl w:val="0"/>
-          <w:numId w:val="5"/>
-        </w:numPr>
         <w:spacing w:after="200" w:line="263" w:lineRule="auto"/>
         <w:rPr>
           <w:rFonts w:eastAsia="Calibri"/>
           <w:b/>
           <w:bCs/>
-          <w:lang w:val="en-CA"/>
         </w:rPr>
       </w:pPr>
     </w:p>
@@ -379,15 +612,13 @@
           <w:rFonts w:eastAsia="Calibri"/>
           <w:b/>
           <w:bCs/>
-          <w:lang w:val="en-CA"/>
-        </w:rPr>
-      </w:pPr>
-      <w:r>
-        <w:rPr>
-          <w:rFonts w:eastAsia="Calibri"/>
-          <w:b/>
-          <w:bCs/>
-          <w:lang w:val="en-CA"/>
+        </w:rPr>
+      </w:pPr>
+      <w:r>
+        <w:rPr>
+          <w:rFonts w:eastAsia="Calibri"/>
+          <w:b/>
+          <w:bCs/>
         </w:rPr>
         <w:t>Content:</w:t>
       </w:r>
@@ -402,17 +633,47 @@
         <w:spacing w:before="240" w:line="360" w:lineRule="auto"/>
         <w:rPr>
           <w:rFonts w:eastAsia="Calibri"/>
-          <w:lang w:val="en-CA"/>
-        </w:rPr>
-      </w:pPr>
-      <w:r>
-        <w:rPr>
-          <w:rFonts w:eastAsia="Calibri"/>
-          <w:b/>
-          <w:bCs/>
-          <w:lang w:val="en-CA"/>
-        </w:rPr>
-        <w:t>Module 1 (Time)</w:t>
+        </w:rPr>
+      </w:pPr>
+      <w:r>
+        <w:rPr>
+          <w:rFonts w:eastAsia="Calibri"/>
+          <w:b/>
+          <w:bCs/>
+        </w:rPr>
+        <w:t xml:space="preserve">Module I: </w:t>
+      </w:r>
+      <w:r>
+        <w:rPr>
+          <w:rFonts w:eastAsia="Calibri"/>
+          <w:b/>
+          <w:bCs/>
+        </w:rPr>
+        <w:t>About the Digital Research Alliance of Canada</w:t>
+      </w:r>
+      <w:r>
+        <w:rPr>
+          <w:rFonts w:eastAsia="Calibri"/>
+          <w:b/>
+          <w:bCs/>
+        </w:rPr>
+        <w:t xml:space="preserve"> (</w:t>
+      </w:r>
+      <w:r>
+        <w:rPr>
+          <w:rFonts w:eastAsia="Calibri"/>
+          <w:b/>
+          <w:bCs/>
+        </w:rPr>
+        <w:t>10min</w:t>
+      </w:r>
+      <w:r>
+        <w:rPr>
+          <w:rFonts w:eastAsia="Calibri"/>
+          <w:b/>
+          <w:bCs/>
+        </w:rPr>
+        <w:t>)</w:t>
       </w:r>
     </w:p>
     <w:p>
@@ -425,43 +686,206 @@
         <w:spacing w:before="240" w:line="360" w:lineRule="auto"/>
         <w:rPr>
           <w:rFonts w:eastAsia="Calibri"/>
-          <w:lang w:val="en-CA"/>
-        </w:rPr>
-      </w:pPr>
-      <w:r>
-        <w:rPr>
-          <w:rFonts w:eastAsia="Calibri"/>
-          <w:lang w:val="en-CA"/>
-        </w:rPr>
-        <w:t>A</w:t>
-      </w:r>
-      <w:r>
-        <w:rPr>
-          <w:rFonts w:eastAsia="Calibri"/>
-          <w:lang w:val="en-CA"/>
-        </w:rPr>
-        <w:t xml:space="preserve"> </w:t>
-      </w:r>
-    </w:p>
-    <w:p>
-      <w:pPr>
-        <w:pStyle w:val="ListParagraph"/>
+        </w:rPr>
+      </w:pPr>
+      <w:r>
+        <w:rPr>
+          <w:rFonts w:eastAsia="Calibri"/>
+        </w:rPr>
+        <w:t>What is the DRAC and the services they offer</w:t>
+      </w:r>
+    </w:p>
+    <w:p>
+      <w:pPr>
+        <w:numPr>
+          <w:ilvl w:val="1"/>
+          <w:numId w:val="2"/>
+        </w:numPr>
+        <w:spacing w:line="360" w:lineRule="auto"/>
+        <w:rPr>
+          <w:rFonts w:eastAsia="Calibri"/>
+        </w:rPr>
+      </w:pPr>
+      <w:r>
+        <w:rPr>
+          <w:rFonts w:eastAsia="Calibri"/>
+        </w:rPr>
+        <w:t>Why do researchers use DRAC services</w:t>
+      </w:r>
+    </w:p>
+    <w:p>
+      <w:pPr>
+        <w:numPr>
+          <w:ilvl w:val="1"/>
+          <w:numId w:val="2"/>
+        </w:numPr>
+        <w:spacing w:line="360" w:lineRule="auto"/>
+        <w:rPr>
+          <w:rFonts w:eastAsia="Calibri"/>
+        </w:rPr>
+      </w:pPr>
+      <w:r>
+        <w:rPr>
+          <w:rFonts w:eastAsia="Calibri"/>
+        </w:rPr>
+        <w:t xml:space="preserve">Workflow description of how you interact </w:t>
+      </w:r>
+      <w:r>
+        <w:rPr>
+          <w:rFonts w:eastAsia="Calibri"/>
+        </w:rPr>
+        <w:t>with</w:t>
+      </w:r>
+      <w:r>
+        <w:rPr>
+          <w:rFonts w:eastAsia="Calibri"/>
+        </w:rPr>
+        <w:t xml:space="preserve"> DRAC’s high-performance computing system</w:t>
+      </w:r>
+    </w:p>
+    <w:p>
+      <w:pPr>
+        <w:numPr>
+          <w:ilvl w:val="1"/>
+          <w:numId w:val="2"/>
+        </w:numPr>
+        <w:spacing w:line="360" w:lineRule="auto"/>
+        <w:rPr>
+          <w:rFonts w:eastAsia="Calibri"/>
+        </w:rPr>
+      </w:pPr>
+      <w:r>
+        <w:rPr>
+          <w:rFonts w:eastAsia="Calibri"/>
+        </w:rPr>
+        <w:lastRenderedPageBreak/>
+        <w:t>Hands-on activity</w:t>
+      </w:r>
+      <w:r>
+        <w:rPr>
+          <w:rFonts w:eastAsia="Calibri"/>
+        </w:rPr>
+        <w:t>: Workflow understanding quiz</w:t>
+      </w:r>
+      <w:r>
+        <w:rPr>
+          <w:rFonts w:eastAsia="Calibri"/>
+        </w:rPr>
+        <w:t xml:space="preserve"> (</w:t>
+      </w:r>
+      <w:r>
+        <w:rPr>
+          <w:rFonts w:eastAsia="Calibri"/>
+        </w:rPr>
+        <w:t>3min</w:t>
+      </w:r>
+      <w:r>
+        <w:rPr>
+          <w:rFonts w:eastAsia="Calibri"/>
+        </w:rPr>
+        <w:t>)</w:t>
+      </w:r>
+      <w:r>
+        <w:rPr>
+          <w:rFonts w:eastAsia="Calibri"/>
+        </w:rPr>
+        <w:br/>
+      </w:r>
+    </w:p>
+    <w:p>
+      <w:pPr>
+        <w:numPr>
+          <w:ilvl w:val="0"/>
+          <w:numId w:val="2"/>
+        </w:numPr>
+        <w:spacing w:line="360" w:lineRule="auto"/>
+        <w:rPr>
+          <w:rFonts w:eastAsia="Calibri"/>
+        </w:rPr>
+      </w:pPr>
+      <w:r>
+        <w:rPr>
+          <w:rFonts w:eastAsia="Calibri"/>
+          <w:b/>
+          <w:bCs/>
+        </w:rPr>
+        <w:t xml:space="preserve">Module </w:t>
+      </w:r>
+      <w:r>
+        <w:rPr>
+          <w:rFonts w:eastAsia="Calibri"/>
+          <w:b/>
+          <w:bCs/>
+        </w:rPr>
+        <w:t xml:space="preserve">II: Preparing your local data and code for high-performance computing </w:t>
+      </w:r>
+      <w:r>
+        <w:rPr>
+          <w:rFonts w:eastAsia="Calibri"/>
+          <w:b/>
+          <w:bCs/>
+        </w:rPr>
+        <w:t>(</w:t>
+      </w:r>
+      <w:r>
+        <w:rPr>
+          <w:rFonts w:eastAsia="Calibri"/>
+          <w:b/>
+          <w:bCs/>
+        </w:rPr>
+        <w:t>20</w:t>
+      </w:r>
+      <w:r>
+        <w:rPr>
+          <w:rFonts w:eastAsia="Calibri"/>
+          <w:b/>
+          <w:bCs/>
+        </w:rPr>
+        <w:t>min</w:t>
+      </w:r>
+      <w:r>
+        <w:rPr>
+          <w:rFonts w:eastAsia="Calibri"/>
+          <w:b/>
+          <w:bCs/>
+        </w:rPr>
+        <w:t>)</w:t>
+      </w:r>
+    </w:p>
+    <w:p>
+      <w:pPr>
+        <w:numPr>
+          <w:ilvl w:val="1"/>
+          <w:numId w:val="2"/>
+        </w:numPr>
+        <w:spacing w:line="360" w:lineRule="auto"/>
+        <w:rPr>
+          <w:rFonts w:eastAsia="Calibri"/>
+        </w:rPr>
+      </w:pPr>
+      <w:r>
+        <w:rPr>
+          <w:rFonts w:eastAsia="Calibri"/>
+        </w:rPr>
+        <w:t>Data and code organization best practices</w:t>
+      </w:r>
+    </w:p>
+    <w:p>
+      <w:pPr>
         <w:numPr>
           <w:ilvl w:val="2"/>
           <w:numId w:val="2"/>
         </w:numPr>
-        <w:spacing w:before="240" w:line="360" w:lineRule="auto"/>
-        <w:rPr>
-          <w:rFonts w:eastAsia="Calibri"/>
-          <w:lang w:val="en-CA"/>
-        </w:rPr>
-      </w:pPr>
-      <w:r>
-        <w:rPr>
-          <w:rFonts w:eastAsia="Calibri"/>
-          <w:lang w:val="en-CA"/>
-        </w:rPr>
-        <w:t>Sub1</w:t>
+        <w:spacing w:line="360" w:lineRule="auto"/>
+        <w:rPr>
+          <w:rFonts w:eastAsia="Calibri"/>
+        </w:rPr>
+      </w:pPr>
+      <w:r>
+        <w:rPr>
+          <w:rFonts w:eastAsia="Calibri"/>
+        </w:rPr>
+        <w:t>Folder organization</w:t>
       </w:r>
     </w:p>
     <w:p>
@@ -473,29 +897,13 @@
         <w:spacing w:line="360" w:lineRule="auto"/>
         <w:rPr>
           <w:rFonts w:eastAsia="Calibri"/>
-          <w:lang w:val="en-CA"/>
-        </w:rPr>
-      </w:pPr>
-      <w:r>
-        <w:rPr>
-          <w:rFonts w:eastAsia="Calibri"/>
-          <w:lang w:val="en-CA"/>
-        </w:rPr>
-        <w:t>S</w:t>
-      </w:r>
-      <w:r>
-        <w:rPr>
-          <w:rFonts w:eastAsia="Calibri"/>
-          <w:lang w:val="en-CA"/>
-        </w:rPr>
-        <w:t>ub</w:t>
-      </w:r>
-      <w:r>
-        <w:rPr>
-          <w:rFonts w:eastAsia="Calibri"/>
-          <w:lang w:val="en-CA"/>
-        </w:rPr>
-        <w:t>2</w:t>
+        </w:rPr>
+      </w:pPr>
+      <w:r>
+        <w:rPr>
+          <w:rFonts w:eastAsia="Calibri"/>
+        </w:rPr>
+        <w:t>Debugging locally</w:t>
       </w:r>
     </w:p>
     <w:p>
@@ -507,15 +915,49 @@
         <w:spacing w:line="360" w:lineRule="auto"/>
         <w:rPr>
           <w:rFonts w:eastAsia="Calibri"/>
-          <w:lang w:val="en-CA"/>
-        </w:rPr>
-      </w:pPr>
-      <w:r>
-        <w:rPr>
-          <w:rFonts w:eastAsia="Calibri"/>
-          <w:lang w:val="en-CA"/>
-        </w:rPr>
-        <w:t xml:space="preserve">B </w:t>
+        </w:rPr>
+      </w:pPr>
+      <w:r>
+        <w:rPr>
+          <w:rFonts w:eastAsia="Calibri"/>
+        </w:rPr>
+        <w:t>How to communicate your computational needs to the high-performance computing system</w:t>
+      </w:r>
+    </w:p>
+    <w:p>
+      <w:pPr>
+        <w:numPr>
+          <w:ilvl w:val="2"/>
+          <w:numId w:val="2"/>
+        </w:numPr>
+        <w:spacing w:line="360" w:lineRule="auto"/>
+        <w:rPr>
+          <w:rFonts w:eastAsia="Calibri"/>
+        </w:rPr>
+      </w:pPr>
+      <w:r>
+        <w:rPr>
+          <w:rFonts w:eastAsia="Calibri"/>
+        </w:rPr>
+        <w:t>What is a job script</w:t>
+      </w:r>
+    </w:p>
+    <w:p>
+      <w:pPr>
+        <w:numPr>
+          <w:ilvl w:val="2"/>
+          <w:numId w:val="2"/>
+        </w:numPr>
+        <w:spacing w:line="360" w:lineRule="auto"/>
+        <w:rPr>
+          <w:rFonts w:eastAsia="Calibri"/>
+        </w:rPr>
+      </w:pPr>
+      <w:r>
+        <w:rPr>
+          <w:rFonts w:eastAsia="Calibri"/>
+        </w:rPr>
+        <w:t>What information must you provide in a job script</w:t>
       </w:r>
     </w:p>
     <w:p>
@@ -527,23 +969,52 @@
         <w:spacing w:line="360" w:lineRule="auto"/>
         <w:rPr>
           <w:rFonts w:eastAsia="Calibri"/>
-          <w:lang w:val="en-CA"/>
-        </w:rPr>
-      </w:pPr>
-      <w:r>
-        <w:rPr>
-          <w:rFonts w:eastAsia="Calibri"/>
-          <w:lang w:val="en-CA"/>
-        </w:rPr>
-        <w:t>Hands-on activity (time)</w:t>
-      </w:r>
-      <w:r>
-        <w:rPr>
-          <w:rFonts w:eastAsia="Calibri"/>
-          <w:lang w:val="en-CA"/>
-        </w:rPr>
-        <w:br/>
-      </w:r>
+        </w:rPr>
+      </w:pPr>
+      <w:r>
+        <w:rPr>
+          <w:rFonts w:eastAsia="Calibri"/>
+        </w:rPr>
+        <w:t>Hands-on activity</w:t>
+      </w:r>
+      <w:r>
+        <w:rPr>
+          <w:rFonts w:eastAsia="Calibri"/>
+        </w:rPr>
+        <w:t xml:space="preserve">: Editing job script template for personal use </w:t>
+      </w:r>
+      <w:r>
+        <w:rPr>
+          <w:rFonts w:eastAsia="Calibri"/>
+        </w:rPr>
+        <w:t>(</w:t>
+      </w:r>
+      <w:r>
+        <w:rPr>
+          <w:rFonts w:eastAsia="Calibri"/>
+        </w:rPr>
+        <w:t>10</w:t>
+      </w:r>
+      <w:r>
+        <w:rPr>
+          <w:rFonts w:eastAsia="Calibri"/>
+        </w:rPr>
+        <w:t>min</w:t>
+      </w:r>
+      <w:r>
+        <w:rPr>
+          <w:rFonts w:eastAsia="Calibri"/>
+        </w:rPr>
+        <w:t>)</w:t>
+      </w:r>
+    </w:p>
+    <w:p>
+      <w:pPr>
+        <w:spacing w:line="360" w:lineRule="auto"/>
+        <w:rPr>
+          <w:rFonts w:eastAsia="Calibri"/>
+        </w:rPr>
+      </w:pPr>
     </w:p>
     <w:p>
       <w:pPr>
@@ -554,17 +1025,87 @@
         <w:spacing w:line="360" w:lineRule="auto"/>
         <w:rPr>
           <w:rFonts w:eastAsia="Calibri"/>
-          <w:lang w:val="en-CA"/>
-        </w:rPr>
-      </w:pPr>
-      <w:r>
-        <w:rPr>
-          <w:rFonts w:eastAsia="Calibri"/>
-          <w:b/>
-          <w:bCs/>
-          <w:lang w:val="en-CA"/>
-        </w:rPr>
-        <w:t>Module 2 (Time)</w:t>
+        </w:rPr>
+      </w:pPr>
+      <w:r>
+        <w:rPr>
+          <w:rFonts w:eastAsia="Calibri"/>
+          <w:b/>
+          <w:bCs/>
+        </w:rPr>
+        <w:t xml:space="preserve">Module </w:t>
+      </w:r>
+      <w:r>
+        <w:rPr>
+          <w:rFonts w:eastAsia="Calibri"/>
+          <w:b/>
+          <w:bCs/>
+        </w:rPr>
+        <w:t>I</w:t>
+      </w:r>
+      <w:r>
+        <w:rPr>
+          <w:rFonts w:eastAsia="Calibri"/>
+          <w:b/>
+          <w:bCs/>
+        </w:rPr>
+        <w:t xml:space="preserve">II: </w:t>
+      </w:r>
+      <w:r>
+        <w:rPr>
+          <w:rFonts w:eastAsia="Calibri"/>
+          <w:b/>
+          <w:bCs/>
+        </w:rPr>
+        <w:t xml:space="preserve">Uploading your data and code to </w:t>
+      </w:r>
+      <w:r>
+        <w:rPr>
+          <w:rFonts w:eastAsia="Calibri"/>
+          <w:b/>
+          <w:bCs/>
+        </w:rPr>
+        <w:t xml:space="preserve">DRAC’s </w:t>
+      </w:r>
+      <w:r>
+        <w:rPr>
+          <w:rFonts w:eastAsia="Calibri"/>
+          <w:b/>
+          <w:bCs/>
+        </w:rPr>
+        <w:t xml:space="preserve">high-performance computing </w:t>
+      </w:r>
+      <w:r>
+        <w:rPr>
+          <w:rFonts w:eastAsia="Calibri"/>
+          <w:b/>
+          <w:bCs/>
+        </w:rPr>
+        <w:t xml:space="preserve">system </w:t>
+      </w:r>
+      <w:r>
+        <w:rPr>
+          <w:rFonts w:eastAsia="Calibri"/>
+          <w:b/>
+          <w:bCs/>
+        </w:rPr>
+        <w:t>(</w:t>
+      </w:r>
+      <w:r>
+        <w:rPr>
+          <w:rFonts w:eastAsia="Calibri"/>
+          <w:b/>
+          <w:bCs/>
+        </w:rPr>
+        <w:t>15min</w:t>
+      </w:r>
+      <w:r>
+        <w:rPr>
+          <w:rFonts w:eastAsia="Calibri"/>
+          <w:b/>
+          <w:bCs/>
+        </w:rPr>
+        <w:t>)</w:t>
       </w:r>
     </w:p>
     <w:p>
@@ -576,15 +1117,91 @@
         <w:spacing w:line="360" w:lineRule="auto"/>
         <w:rPr>
           <w:rFonts w:eastAsia="Calibri"/>
-          <w:lang w:val="en-CA"/>
-        </w:rPr>
-      </w:pPr>
-      <w:r>
-        <w:rPr>
-          <w:rFonts w:eastAsia="Calibri"/>
-          <w:lang w:val="en-CA"/>
-        </w:rPr>
-        <w:t>A.2 (time)</w:t>
+        </w:rPr>
+      </w:pPr>
+      <w:r>
+        <w:rPr>
+          <w:rFonts w:eastAsia="Calibri"/>
+        </w:rPr>
+        <w:t>Introduction to DRAC’s file transfer system (Globus)</w:t>
+      </w:r>
+    </w:p>
+    <w:p>
+      <w:pPr>
+        <w:numPr>
+          <w:ilvl w:val="1"/>
+          <w:numId w:val="2"/>
+        </w:numPr>
+        <w:spacing w:line="360" w:lineRule="auto"/>
+        <w:rPr>
+          <w:rFonts w:eastAsia="Calibri"/>
+        </w:rPr>
+      </w:pPr>
+      <w:r>
+        <w:rPr>
+          <w:rFonts w:eastAsia="Calibri"/>
+        </w:rPr>
+        <w:t>Alternate file transfer methods and their use cases</w:t>
+      </w:r>
+    </w:p>
+    <w:p>
+      <w:pPr>
+        <w:numPr>
+          <w:ilvl w:val="1"/>
+          <w:numId w:val="2"/>
+        </w:numPr>
+        <w:spacing w:line="360" w:lineRule="auto"/>
+        <w:rPr>
+          <w:rFonts w:eastAsia="Calibri"/>
+        </w:rPr>
+      </w:pPr>
+      <w:r>
+        <w:rPr>
+          <w:rFonts w:eastAsia="Calibri"/>
+        </w:rPr>
+        <w:t>Hands-on activity</w:t>
+      </w:r>
+      <w:r>
+        <w:rPr>
+          <w:rFonts w:eastAsia="Calibri"/>
+        </w:rPr>
+        <w:t xml:space="preserve">: </w:t>
+      </w:r>
+      <w:r>
+        <w:rPr>
+          <w:rFonts w:eastAsia="Calibri"/>
+        </w:rPr>
+        <w:t>Upload workshop data and code to DRAC using Globus Personal Connect</w:t>
+      </w:r>
+      <w:r>
+        <w:rPr>
+          <w:rFonts w:eastAsia="Calibri"/>
+        </w:rPr>
+        <w:t xml:space="preserve"> </w:t>
+      </w:r>
+      <w:r>
+        <w:rPr>
+          <w:rFonts w:eastAsia="Calibri"/>
+        </w:rPr>
+        <w:t>(</w:t>
+      </w:r>
+      <w:r>
+        <w:rPr>
+          <w:rFonts w:eastAsia="Calibri"/>
+        </w:rPr>
+        <w:t>10</w:t>
+      </w:r>
+      <w:r>
+        <w:rPr>
+          <w:rFonts w:eastAsia="Calibri"/>
+        </w:rPr>
+        <w:t>min</w:t>
+      </w:r>
+      <w:r>
+        <w:rPr>
+          <w:rFonts w:eastAsia="Calibri"/>
+        </w:rPr>
+        <w:t>)</w:t>
       </w:r>
     </w:p>
     <w:p>
@@ -596,15 +1213,365 @@
         <w:spacing w:line="360" w:lineRule="auto"/>
         <w:rPr>
           <w:rFonts w:eastAsia="Calibri"/>
-          <w:lang w:val="en-CA"/>
-        </w:rPr>
-      </w:pPr>
-      <w:r>
-        <w:rPr>
-          <w:rFonts w:eastAsia="Calibri"/>
-          <w:lang w:val="en-CA"/>
-        </w:rPr>
-        <w:t>sub1</w:t>
+        </w:rPr>
+      </w:pPr>
+      <w:r>
+        <w:rPr>
+          <w:rFonts w:eastAsia="Calibri"/>
+        </w:rPr>
+        <w:t>Practice basic command line navigation commands (cd, ls, etc.) to confirm file transfer success</w:t>
+      </w:r>
+    </w:p>
+    <w:p>
+      <w:pPr>
+        <w:spacing w:line="360" w:lineRule="auto"/>
+        <w:rPr>
+          <w:rFonts w:eastAsia="Calibri"/>
+        </w:rPr>
+      </w:pPr>
+    </w:p>
+    <w:p>
+      <w:pPr>
+        <w:numPr>
+          <w:ilvl w:val="0"/>
+          <w:numId w:val="2"/>
+        </w:numPr>
+        <w:spacing w:line="360" w:lineRule="auto"/>
+        <w:rPr>
+          <w:rFonts w:eastAsia="Calibri"/>
+        </w:rPr>
+      </w:pPr>
+      <w:r>
+        <w:rPr>
+          <w:rFonts w:eastAsia="Calibri"/>
+          <w:b/>
+          <w:bCs/>
+        </w:rPr>
+        <w:t xml:space="preserve">Module </w:t>
+      </w:r>
+      <w:r>
+        <w:rPr>
+          <w:rFonts w:eastAsia="Calibri"/>
+          <w:b/>
+          <w:bCs/>
+        </w:rPr>
+        <w:t>I</w:t>
+      </w:r>
+      <w:r>
+        <w:rPr>
+          <w:rFonts w:eastAsia="Calibri"/>
+          <w:b/>
+          <w:bCs/>
+        </w:rPr>
+        <w:t>V</w:t>
+      </w:r>
+      <w:r>
+        <w:rPr>
+          <w:rFonts w:eastAsia="Calibri"/>
+          <w:b/>
+          <w:bCs/>
+        </w:rPr>
+        <w:t xml:space="preserve">: </w:t>
+      </w:r>
+      <w:r>
+        <w:rPr>
+          <w:rFonts w:eastAsia="Calibri"/>
+          <w:b/>
+          <w:bCs/>
+        </w:rPr>
+        <w:t>Running your</w:t>
+      </w:r>
+      <w:r>
+        <w:rPr>
+          <w:rFonts w:eastAsia="Calibri"/>
+          <w:b/>
+          <w:bCs/>
+        </w:rPr>
+        <w:t xml:space="preserve"> code </w:t>
+      </w:r>
+      <w:r>
+        <w:rPr>
+          <w:rFonts w:eastAsia="Calibri"/>
+          <w:b/>
+          <w:bCs/>
+        </w:rPr>
+        <w:t>using</w:t>
+      </w:r>
+      <w:r>
+        <w:rPr>
+          <w:rFonts w:eastAsia="Calibri"/>
+          <w:b/>
+          <w:bCs/>
+        </w:rPr>
+        <w:t xml:space="preserve"> DRAC’s high-performance computing system </w:t>
+      </w:r>
+      <w:r>
+        <w:rPr>
+          <w:rFonts w:eastAsia="Calibri"/>
+          <w:b/>
+          <w:bCs/>
+        </w:rPr>
+        <w:t>(</w:t>
+      </w:r>
+      <w:r>
+        <w:rPr>
+          <w:rFonts w:eastAsia="Calibri"/>
+          <w:b/>
+          <w:bCs/>
+        </w:rPr>
+        <w:t>30</w:t>
+      </w:r>
+      <w:r>
+        <w:rPr>
+          <w:rFonts w:eastAsia="Calibri"/>
+          <w:b/>
+          <w:bCs/>
+        </w:rPr>
+        <w:t>min</w:t>
+      </w:r>
+      <w:r>
+        <w:rPr>
+          <w:rFonts w:eastAsia="Calibri"/>
+          <w:b/>
+          <w:bCs/>
+        </w:rPr>
+        <w:t>)</w:t>
+      </w:r>
+    </w:p>
+    <w:p>
+      <w:pPr>
+        <w:numPr>
+          <w:ilvl w:val="1"/>
+          <w:numId w:val="2"/>
+        </w:numPr>
+        <w:spacing w:line="360" w:lineRule="auto"/>
+        <w:rPr>
+          <w:rFonts w:eastAsia="Calibri"/>
+        </w:rPr>
+      </w:pPr>
+      <w:r>
+        <w:rPr>
+          <w:rFonts w:eastAsia="Calibri"/>
+        </w:rPr>
+        <w:t>How to “submit a job”</w:t>
+      </w:r>
+    </w:p>
+    <w:p>
+      <w:pPr>
+        <w:numPr>
+          <w:ilvl w:val="1"/>
+          <w:numId w:val="2"/>
+        </w:numPr>
+        <w:spacing w:line="360" w:lineRule="auto"/>
+        <w:rPr>
+          <w:rFonts w:eastAsia="Calibri"/>
+        </w:rPr>
+      </w:pPr>
+      <w:r>
+        <w:rPr>
+          <w:rFonts w:eastAsia="Calibri"/>
+        </w:rPr>
+        <w:t>How to check on the status of your job</w:t>
+      </w:r>
+    </w:p>
+    <w:p>
+      <w:pPr>
+        <w:numPr>
+          <w:ilvl w:val="1"/>
+          <w:numId w:val="2"/>
+        </w:numPr>
+        <w:spacing w:line="360" w:lineRule="auto"/>
+        <w:rPr>
+          <w:rFonts w:eastAsia="Calibri"/>
+        </w:rPr>
+      </w:pPr>
+      <w:r>
+        <w:rPr>
+          <w:rFonts w:eastAsia="Calibri"/>
+        </w:rPr>
+        <w:t>How to interpret output files and error messages</w:t>
+      </w:r>
+    </w:p>
+    <w:p>
+      <w:pPr>
+        <w:numPr>
+          <w:ilvl w:val="1"/>
+          <w:numId w:val="2"/>
+        </w:numPr>
+        <w:spacing w:line="360" w:lineRule="auto"/>
+        <w:rPr>
+          <w:rFonts w:eastAsia="Calibri"/>
+        </w:rPr>
+      </w:pPr>
+      <w:r>
+        <w:rPr>
+          <w:rFonts w:eastAsia="Calibri"/>
+        </w:rPr>
+        <w:t>Hands-on activity</w:t>
+      </w:r>
+      <w:r>
+        <w:rPr>
+          <w:rFonts w:eastAsia="Calibri"/>
+        </w:rPr>
+        <w:t xml:space="preserve">: </w:t>
+      </w:r>
+      <w:r>
+        <w:rPr>
+          <w:rFonts w:eastAsia="Calibri"/>
+        </w:rPr>
+        <w:t xml:space="preserve">Submit a job, interpret output, address error </w:t>
+      </w:r>
+      <w:r>
+        <w:rPr>
+          <w:rFonts w:eastAsia="Calibri"/>
+        </w:rPr>
+        <w:t>(</w:t>
+      </w:r>
+      <w:r>
+        <w:rPr>
+          <w:rFonts w:eastAsia="Calibri"/>
+        </w:rPr>
+        <w:t>20</w:t>
+      </w:r>
+      <w:r>
+        <w:rPr>
+          <w:rFonts w:eastAsia="Calibri"/>
+        </w:rPr>
+        <w:t>min</w:t>
+      </w:r>
+      <w:r>
+        <w:rPr>
+          <w:rFonts w:eastAsia="Calibri"/>
+        </w:rPr>
+        <w:t>)</w:t>
+      </w:r>
+    </w:p>
+    <w:p>
+      <w:pPr>
+        <w:spacing w:line="360" w:lineRule="auto"/>
+        <w:rPr>
+          <w:rFonts w:eastAsia="Calibri"/>
+        </w:rPr>
+      </w:pPr>
+    </w:p>
+    <w:p>
+      <w:pPr>
+        <w:numPr>
+          <w:ilvl w:val="0"/>
+          <w:numId w:val="2"/>
+        </w:numPr>
+        <w:spacing w:line="360" w:lineRule="auto"/>
+        <w:rPr>
+          <w:rFonts w:eastAsia="Calibri"/>
+        </w:rPr>
+      </w:pPr>
+      <w:r>
+        <w:rPr>
+          <w:rFonts w:eastAsia="Calibri"/>
+          <w:b/>
+          <w:bCs/>
+        </w:rPr>
+        <w:t xml:space="preserve">Module </w:t>
+      </w:r>
+      <w:r>
+        <w:rPr>
+          <w:rFonts w:eastAsia="Calibri"/>
+          <w:b/>
+          <w:bCs/>
+        </w:rPr>
+        <w:t xml:space="preserve">V: </w:t>
+      </w:r>
+      <w:r>
+        <w:rPr>
+          <w:rFonts w:eastAsia="Calibri"/>
+          <w:b/>
+          <w:bCs/>
+        </w:rPr>
+        <w:t xml:space="preserve">Optimizing your code for </w:t>
+      </w:r>
+      <w:bookmarkStart w:id="0" w:name="_Hlk235200506"/>
+      <w:r>
+        <w:rPr>
+          <w:rFonts w:eastAsia="Calibri"/>
+          <w:b/>
+          <w:bCs/>
+        </w:rPr>
+        <w:t>high-performance computing</w:t>
+      </w:r>
+      <w:bookmarkEnd w:id="0"/>
+      <w:r>
+        <w:rPr>
+          <w:rFonts w:eastAsia="Calibri"/>
+          <w:b/>
+          <w:bCs/>
+        </w:rPr>
+        <w:t xml:space="preserve"> </w:t>
+      </w:r>
+      <w:r>
+        <w:rPr>
+          <w:rFonts w:eastAsia="Calibri"/>
+          <w:b/>
+          <w:bCs/>
+        </w:rPr>
+        <w:t>(</w:t>
+      </w:r>
+      <w:r>
+        <w:rPr>
+          <w:rFonts w:eastAsia="Calibri"/>
+          <w:b/>
+          <w:bCs/>
+        </w:rPr>
+        <w:t>30min</w:t>
+      </w:r>
+      <w:r>
+        <w:rPr>
+          <w:rFonts w:eastAsia="Calibri"/>
+          <w:b/>
+          <w:bCs/>
+        </w:rPr>
+        <w:t>)</w:t>
+      </w:r>
+      <w:r>
+        <w:rPr>
+          <w:rFonts w:eastAsia="Calibri"/>
+        </w:rPr>
+        <w:t xml:space="preserve"> </w:t>
+      </w:r>
+    </w:p>
+    <w:p>
+      <w:pPr>
+        <w:numPr>
+          <w:ilvl w:val="1"/>
+          <w:numId w:val="2"/>
+        </w:numPr>
+        <w:spacing w:line="360" w:lineRule="auto"/>
+        <w:rPr>
+          <w:rFonts w:eastAsia="Calibri"/>
+        </w:rPr>
+      </w:pPr>
+      <w:r>
+        <w:rPr>
+          <w:rFonts w:eastAsia="Calibri"/>
+        </w:rPr>
+        <w:t xml:space="preserve">Overview of DRAC </w:t>
+      </w:r>
+      <w:r>
+        <w:rPr>
+          <w:rFonts w:eastAsia="Calibri"/>
+        </w:rPr>
+        <w:t>high-performance computing</w:t>
+      </w:r>
+      <w:r>
+        <w:rPr>
+          <w:rFonts w:eastAsia="Calibri"/>
+        </w:rPr>
+        <w:t xml:space="preserve"> </w:t>
+      </w:r>
+      <w:r>
+        <w:rPr>
+          <w:rFonts w:eastAsia="Calibri"/>
+        </w:rPr>
+        <w:t xml:space="preserve">clusters </w:t>
       </w:r>
     </w:p>
     <w:p>
@@ -616,15 +1583,19 @@
         <w:spacing w:line="360" w:lineRule="auto"/>
         <w:rPr>
           <w:rFonts w:eastAsia="Calibri"/>
-          <w:lang w:val="en-CA"/>
-        </w:rPr>
-      </w:pPr>
-      <w:r>
-        <w:rPr>
-          <w:rFonts w:eastAsia="Calibri"/>
-          <w:lang w:val="en-CA"/>
-        </w:rPr>
-        <w:t>sub2</w:t>
+        </w:rPr>
+      </w:pPr>
+      <w:r>
+        <w:rPr>
+          <w:rFonts w:eastAsia="Calibri"/>
+        </w:rPr>
+        <w:t>How to choose the best</w:t>
+      </w:r>
+      <w:r>
+        <w:rPr>
+          <w:rFonts w:eastAsia="Calibri"/>
+        </w:rPr>
+        <w:t xml:space="preserve"> cluster for your specific computational needs</w:t>
       </w:r>
     </w:p>
     <w:p>
@@ -636,15 +1607,37 @@
         <w:spacing w:line="360" w:lineRule="auto"/>
         <w:rPr>
           <w:rFonts w:eastAsia="Calibri"/>
-          <w:lang w:val="en-CA"/>
-        </w:rPr>
-      </w:pPr>
-      <w:r>
-        <w:rPr>
-          <w:rFonts w:eastAsia="Calibri"/>
-          <w:lang w:val="en-CA"/>
-        </w:rPr>
-        <w:t>B.2</w:t>
+        </w:rPr>
+      </w:pPr>
+      <w:r>
+        <w:rPr>
+          <w:rFonts w:eastAsia="Calibri"/>
+        </w:rPr>
+        <w:t>Submitting multiple jobs</w:t>
+      </w:r>
+    </w:p>
+    <w:p>
+      <w:pPr>
+        <w:numPr>
+          <w:ilvl w:val="2"/>
+          <w:numId w:val="2"/>
+        </w:numPr>
+        <w:spacing w:line="360" w:lineRule="auto"/>
+        <w:rPr>
+          <w:rFonts w:eastAsia="Calibri"/>
+        </w:rPr>
+      </w:pPr>
+      <w:r>
+        <w:rPr>
+          <w:rFonts w:eastAsia="Calibri"/>
+        </w:rPr>
+        <w:t xml:space="preserve">Introduction to bash scripting and </w:t>
+      </w:r>
+      <w:r>
+        <w:rPr>
+          <w:rFonts w:eastAsia="Calibri"/>
+        </w:rPr>
+        <w:t>parameter variables</w:t>
       </w:r>
     </w:p>
     <w:p>
@@ -656,21 +1649,49 @@
         <w:spacing w:line="360" w:lineRule="auto"/>
         <w:rPr>
           <w:rFonts w:eastAsia="Calibri"/>
-          <w:lang w:val="en-CA"/>
-        </w:rPr>
-      </w:pPr>
-      <w:r>
-        <w:rPr>
-          <w:rFonts w:eastAsia="Calibri"/>
-          <w:lang w:val="en-CA"/>
-        </w:rPr>
-        <w:t>Hands-on activity 2 (time)</w:t>
+        </w:rPr>
+      </w:pPr>
+      <w:r>
+        <w:rPr>
+          <w:rFonts w:eastAsia="Calibri"/>
+        </w:rPr>
+        <w:t>Hands-on activity</w:t>
+      </w:r>
+      <w:r>
+        <w:rPr>
+          <w:rFonts w:eastAsia="Calibri"/>
+        </w:rPr>
+        <w:t xml:space="preserve">: </w:t>
+      </w:r>
+      <w:r>
+        <w:rPr>
+          <w:rFonts w:eastAsia="Calibri"/>
+        </w:rPr>
+        <w:t xml:space="preserve">Edit your code to accommodate multi-job submissions </w:t>
+      </w:r>
+      <w:r>
+        <w:rPr>
+          <w:rFonts w:eastAsia="Calibri"/>
+        </w:rPr>
+        <w:t>(</w:t>
+      </w:r>
+      <w:r>
+        <w:rPr>
+          <w:rFonts w:eastAsia="Calibri"/>
+        </w:rPr>
+        <w:t>20min</w:t>
+      </w:r>
+      <w:r>
+        <w:rPr>
+          <w:rFonts w:eastAsia="Calibri"/>
+        </w:rPr>
+        <w:t>)</w:t>
       </w:r>
     </w:p>
     <w:sectPr>
-      <w:headerReference w:type="default" r:id="rId7"/>
-      <w:headerReference w:type="first" r:id="rId8"/>
-      <w:pgSz w:w="11909" w:h="16834" w:orient="portrait"/>
+      <w:headerReference w:type="default" r:id="rId10"/>
+      <w:headerReference w:type="first" r:id="rId11"/>
+      <w:pgSz w:w="11909" w:h="16834"/>
       <w:pgMar w:top="1440" w:right="1440" w:bottom="1440" w:left="1440" w:header="720" w:footer="720" w:gutter="0"/>
       <w:pgNumType w:start="1"/>
       <w:cols w:space="720"/>
@@ -681,7 +1702,7 @@
 </file>
 
 <file path=word/endnotes.xml><?xml version="1.0" encoding="utf-8"?>
-<w:endnotes xmlns:wpc="http://schemas.microsoft.com/office/word/2010/wordprocessingCanvas" xmlns:cx="http://schemas.microsoft.com/office/drawing/2014/chartex" xmlns:cx1="http://schemas.microsoft.com/office/drawing/2015/9/8/chartex" xmlns:cx2="http://schemas.microsoft.com/office/drawing/2015/10/21/chartex" xmlns:cx3="http://schemas.microsoft.com/office/drawing/2016/5/9/chartex" xmlns:cx4="http://schemas.microsoft.com/office/drawing/2016/5/10/chartex" xmlns:cx5="http://schemas.microsoft.com/office/drawing/2016/5/11/chartex" xmlns:cx6="http://schemas.microsoft.com/office/drawing/2016/5/12/chartex" xmlns:cx7="http://schemas.microsoft.com/office/drawing/2016/5/13/chartex" xmlns:cx8="http://schemas.microsoft.com/office/drawing/2016/5/14/chartex" xmlns:mc="http://schemas.openxmlformats.org/markup-compatibility/2006" xmlns:aink="http://schemas.microsoft.com/office/drawing/2016/ink" xmlns:am3d="http://schemas.microsoft.com/office/drawing/2017/model3d" xmlns:o="urn:schemas-microsoft-com:office:office" xmlns:oel="http://schemas.microsoft.com/office/2019/extlst" xmlns:r="http://schemas.openxmlformats.org/officeDocument/2006/relationships" xmlns:m="http://schemas.openxmlformats.org/officeDocument/2006/math" xmlns:v="urn:schemas-microsoft-com:vml" xmlns:wp14="http://schemas.microsoft.com/office/word/2010/wordprocessingDrawing" xmlns:wp="http://schemas.openxmlformats.org/drawingml/2006/wordprocessingDrawing" xmlns:w10="urn:schemas-microsoft-com:office:word" xmlns:w="http://schemas.openxmlformats.org/wordprocessingml/2006/main" xmlns:w14="http://schemas.microsoft.com/office/word/2010/wordml" xmlns:w15="http://schemas.microsoft.com/office/word/2012/wordml" xmlns:w16cex="http://schemas.microsoft.com/office/word/2018/wordml/cex" xmlns:w16cid="http://schemas.microsoft.com/office/word/2016/wordml/cid" xmlns:w16="http://schemas.microsoft.com/office/word/2018/wordml" xmlns:w16sdtdh="http://schemas.microsoft.com/office/word/2020/wordml/sdtdatahash" xmlns:w16se="http://schemas.microsoft.com/office/word/2015/wordml/symex" xmlns:wpg="http://schemas.microsoft.com/office/word/2010/wordprocessingGroup" xmlns:wpi="http://schemas.microsoft.com/office/word/2010/wordprocessingInk" xmlns:wne="http://schemas.microsoft.com/office/word/2006/wordml" xmlns:wps="http://schemas.microsoft.com/office/word/2010/wordprocessingShape" mc:Ignorable="w14 w15 w16se w16cid w16 w16cex w16sdtdh wp14">
+<w:endnotes xmlns:wpc="http://schemas.microsoft.com/office/word/2010/wordprocessingCanvas" xmlns:cx="http://schemas.microsoft.com/office/drawing/2014/chartex" xmlns:cx1="http://schemas.microsoft.com/office/drawing/2015/9/8/chartex" xmlns:cx2="http://schemas.microsoft.com/office/drawing/2015/10/21/chartex" xmlns:cx3="http://schemas.microsoft.com/office/drawing/2016/5/9/chartex" xmlns:cx4="http://schemas.microsoft.com/office/drawing/2016/5/10/chartex" xmlns:cx5="http://schemas.microsoft.com/office/drawing/2016/5/11/chartex" xmlns:cx6="http://schemas.microsoft.com/office/drawing/2016/5/12/chartex" xmlns:cx7="http://schemas.microsoft.com/office/drawing/2016/5/13/chartex" xmlns:cx8="http://schemas.microsoft.com/office/drawing/2016/5/14/chartex" xmlns:mc="http://schemas.openxmlformats.org/markup-compatibility/2006" xmlns:aink="http://schemas.microsoft.com/office/drawing/2016/ink" xmlns:am3d="http://schemas.microsoft.com/office/drawing/2017/model3d" xmlns:o="urn:schemas-microsoft-com:office:office" xmlns:oel="http://schemas.microsoft.com/office/2019/extlst" xmlns:r="http://schemas.openxmlformats.org/officeDocument/2006/relationships" xmlns:m="http://schemas.openxmlformats.org/officeDocument/2006/math" xmlns:v="urn:schemas-microsoft-com:vml" xmlns:wp14="http://schemas.microsoft.com/office/word/2010/wordprocessingDrawing" xmlns:wp="http://schemas.openxmlformats.org/drawingml/2006/wordprocessingDrawing" xmlns:w10="urn:schemas-microsoft-com:office:word" xmlns:w="http://schemas.openxmlformats.org/wordprocessingml/2006/main" xmlns:w14="http://schemas.microsoft.com/office/word/2010/wordml" xmlns:w15="http://schemas.microsoft.com/office/word/2012/wordml" xmlns:w16cex="http://schemas.microsoft.com/office/word/2018/wordml/cex" xmlns:w16cid="http://schemas.microsoft.com/office/word/2016/wordml/cid" xmlns:w16="http://schemas.microsoft.com/office/word/2018/wordml" xmlns:w16du="http://schemas.microsoft.com/office/word/2023/wordml/word16du" xmlns:w16sdtdh="http://schemas.microsoft.com/office/word/2020/wordml/sdtdatahash" xmlns:w16sdtfl="http://schemas.microsoft.com/office/word/2024/wordml/sdtformatlock" xmlns:w16se="http://schemas.microsoft.com/office/word/2015/wordml/symex" xmlns:wpg="http://schemas.microsoft.com/office/word/2010/wordprocessingGroup" xmlns:wpi="http://schemas.microsoft.com/office/word/2010/wordprocessingInk" xmlns:wne="http://schemas.microsoft.com/office/word/2006/wordml" xmlns:wps="http://schemas.microsoft.com/office/word/2010/wordprocessingShape" mc:Ignorable="w14 w15 w16se w16cid w16 w16cex w16sdtdh w16sdtfl w16du wp14">
   <w:endnote w:type="separator" w:id="-1">
     <w:p>
       <w:pPr>
@@ -706,7 +1727,7 @@
 </file>
 
 <file path=word/footnotes.xml><?xml version="1.0" encoding="utf-8"?>
-<w:footnotes xmlns:wpc="http://schemas.microsoft.com/office/word/2010/wordprocessingCanvas" xmlns:cx="http://schemas.microsoft.com/office/drawing/2014/chartex" xmlns:cx1="http://schemas.microsoft.com/office/drawing/2015/9/8/chartex" xmlns:cx2="http://schemas.microsoft.com/office/drawing/2015/10/21/chartex" xmlns:cx3="http://schemas.microsoft.com/office/drawing/2016/5/9/chartex" xmlns:cx4="http://schemas.microsoft.com/office/drawing/2016/5/10/chartex" xmlns:cx5="http://schemas.microsoft.com/office/drawing/2016/5/11/chartex" xmlns:cx6="http://schemas.microsoft.com/office/drawing/2016/5/12/chartex" xmlns:cx7="http://schemas.microsoft.com/office/drawing/2016/5/13/chartex" xmlns:cx8="http://schemas.microsoft.com/office/drawing/2016/5/14/chartex" xmlns:mc="http://schemas.openxmlformats.org/markup-compatibility/2006" xmlns:aink="http://schemas.microsoft.com/office/drawing/2016/ink" xmlns:am3d="http://schemas.microsoft.com/office/drawing/2017/model3d" xmlns:o="urn:schemas-microsoft-com:office:office" xmlns:oel="http://schemas.microsoft.com/office/2019/extlst" xmlns:r="http://schemas.openxmlformats.org/officeDocument/2006/relationships" xmlns:m="http://schemas.openxmlformats.org/officeDocument/2006/math" xmlns:v="urn:schemas-microsoft-com:vml" xmlns:wp14="http://schemas.microsoft.com/office/word/2010/wordprocessingDrawing" xmlns:wp="http://schemas.openxmlformats.org/drawingml/2006/wordprocessingDrawing" xmlns:w10="urn:schemas-microsoft-com:office:word" xmlns:w="http://schemas.openxmlformats.org/wordprocessingml/2006/main" xmlns:w14="http://schemas.microsoft.com/office/word/2010/wordml" xmlns:w15="http://schemas.microsoft.com/office/word/2012/wordml" xmlns:w16cex="http://schemas.microsoft.com/office/word/2018/wordml/cex" xmlns:w16cid="http://schemas.microsoft.com/office/word/2016/wordml/cid" xmlns:w16="http://schemas.microsoft.com/office/word/2018/wordml" xmlns:w16sdtdh="http://schemas.microsoft.com/office/word/2020/wordml/sdtdatahash" xmlns:w16se="http://schemas.microsoft.com/office/word/2015/wordml/symex" xmlns:wpg="http://schemas.microsoft.com/office/word/2010/wordprocessingGroup" xmlns:wpi="http://schemas.microsoft.com/office/word/2010/wordprocessingInk" xmlns:wne="http://schemas.microsoft.com/office/word/2006/wordml" xmlns:wps="http://schemas.microsoft.com/office/word/2010/wordprocessingShape" mc:Ignorable="w14 w15 w16se w16cid w16 w16cex w16sdtdh wp14">
+<w:footnotes xmlns:wpc="http://schemas.microsoft.com/office/word/2010/wordprocessingCanvas" xmlns:cx="http://schemas.microsoft.com/office/drawing/2014/chartex" xmlns:cx1="http://schemas.microsoft.com/office/drawing/2015/9/8/chartex" xmlns:cx2="http://schemas.microsoft.com/office/drawing/2015/10/21/chartex" xmlns:cx3="http://schemas.microsoft.com/office/drawing/2016/5/9/chartex" xmlns:cx4="http://schemas.microsoft.com/office/drawing/2016/5/10/chartex" xmlns:cx5="http://schemas.microsoft.com/office/drawing/2016/5/11/chartex" xmlns:cx6="http://schemas.microsoft.com/office/drawing/2016/5/12/chartex" xmlns:cx7="http://schemas.microsoft.com/office/drawing/2016/5/13/chartex" xmlns:cx8="http://schemas.microsoft.com/office/drawing/2016/5/14/chartex" xmlns:mc="http://schemas.openxmlformats.org/markup-compatibility/2006" xmlns:aink="http://schemas.microsoft.com/office/drawing/2016/ink" xmlns:am3d="http://schemas.microsoft.com/office/drawing/2017/model3d" xmlns:o="urn:schemas-microsoft-com:office:office" xmlns:oel="http://schemas.microsoft.com/office/2019/extlst" xmlns:r="http://schemas.openxmlformats.org/officeDocument/2006/relationships" xmlns:m="http://schemas.openxmlformats.org/officeDocument/2006/math" xmlns:v="urn:schemas-microsoft-com:vml" xmlns:wp14="http://schemas.microsoft.com/office/word/2010/wordprocessingDrawing" xmlns:wp="http://schemas.openxmlformats.org/drawingml/2006/wordprocessingDrawing" xmlns:w10="urn:schemas-microsoft-com:office:word" xmlns:w="http://schemas.openxmlformats.org/wordprocessingml/2006/main" xmlns:w14="http://schemas.microsoft.com/office/word/2010/wordml" xmlns:w15="http://schemas.microsoft.com/office/word/2012/wordml" xmlns:w16cex="http://schemas.microsoft.com/office/word/2018/wordml/cex" xmlns:w16cid="http://schemas.microsoft.com/office/word/2016/wordml/cid" xmlns:w16="http://schemas.microsoft.com/office/word/2018/wordml" xmlns:w16du="http://schemas.microsoft.com/office/word/2023/wordml/word16du" xmlns:w16sdtdh="http://schemas.microsoft.com/office/word/2020/wordml/sdtdatahash" xmlns:w16sdtfl="http://schemas.microsoft.com/office/word/2024/wordml/sdtformatlock" xmlns:w16se="http://schemas.microsoft.com/office/word/2015/wordml/symex" xmlns:wpg="http://schemas.microsoft.com/office/word/2010/wordprocessingGroup" xmlns:wpi="http://schemas.microsoft.com/office/word/2010/wordprocessingInk" xmlns:wne="http://schemas.microsoft.com/office/word/2006/wordml" xmlns:wps="http://schemas.microsoft.com/office/word/2010/wordprocessingShape" mc:Ignorable="w14 w15 w16se w16cid w16 w16cex w16sdtdh w16sdtfl w16du wp14">
   <w:footnote w:type="separator" w:id="-1">
     <w:p>
       <w:pPr>
@@ -731,7 +1752,7 @@
 </file>
 
 <file path=word/header1.xml><?xml version="1.0" encoding="utf-8"?>
-<w:hdr xmlns:wpc="http://schemas.microsoft.com/office/word/2010/wordprocessingCanvas" xmlns:cx="http://schemas.microsoft.com/office/drawing/2014/chartex" xmlns:cx1="http://schemas.microsoft.com/office/drawing/2015/9/8/chartex" xmlns:cx2="http://schemas.microsoft.com/office/drawing/2015/10/21/chartex" xmlns:cx3="http://schemas.microsoft.com/office/drawing/2016/5/9/chartex" xmlns:cx4="http://schemas.microsoft.com/office/drawing/2016/5/10/chartex" xmlns:cx5="http://schemas.microsoft.com/office/drawing/2016/5/11/chartex" xmlns:cx6="http://schemas.microsoft.com/office/drawing/2016/5/12/chartex" xmlns:cx7="http://schemas.microsoft.com/office/drawing/2016/5/13/chartex" xmlns:cx8="http://schemas.microsoft.com/office/drawing/2016/5/14/chartex" xmlns:mc="http://schemas.openxmlformats.org/markup-compatibility/2006" xmlns:aink="http://schemas.microsoft.com/office/drawing/2016/ink" xmlns:am3d="http://schemas.microsoft.com/office/drawing/2017/model3d" xmlns:o="urn:schemas-microsoft-com:office:office" xmlns:oel="http://schemas.microsoft.com/office/2019/extlst" xmlns:r="http://schemas.openxmlformats.org/officeDocument/2006/relationships" xmlns:m="http://schemas.openxmlformats.org/officeDocument/2006/math" xmlns:v="urn:schemas-microsoft-com:vml" xmlns:wp14="http://schemas.microsoft.com/office/word/2010/wordprocessingDrawing" xmlns:wp="http://schemas.openxmlformats.org/drawingml/2006/wordprocessingDrawing" xmlns:w10="urn:schemas-microsoft-com:office:word" xmlns:w="http://schemas.openxmlformats.org/wordprocessingml/2006/main" xmlns:w14="http://schemas.microsoft.com/office/word/2010/wordml" xmlns:w15="http://schemas.microsoft.com/office/word/2012/wordml" xmlns:w16cex="http://schemas.microsoft.com/office/word/2018/wordml/cex" xmlns:w16cid="http://schemas.microsoft.com/office/word/2016/wordml/cid" xmlns:w16="http://schemas.microsoft.com/office/word/2018/wordml" xmlns:w16sdtdh="http://schemas.microsoft.com/office/word/2020/wordml/sdtdatahash" xmlns:w16se="http://schemas.microsoft.com/office/word/2015/wordml/symex" xmlns:wpg="http://schemas.microsoft.com/office/word/2010/wordprocessingGroup" xmlns:wpi="http://schemas.microsoft.com/office/word/2010/wordprocessingInk" xmlns:wne="http://schemas.microsoft.com/office/word/2006/wordml" xmlns:wps="http://schemas.microsoft.com/office/word/2010/wordprocessingShape" mc:Ignorable="w14 w15 w16se w16cid w16 w16cex w16sdtdh wp14">
+<w:hdr xmlns:wpc="http://schemas.microsoft.com/office/word/2010/wordprocessingCanvas" xmlns:cx="http://schemas.microsoft.com/office/drawing/2014/chartex" xmlns:cx1="http://schemas.microsoft.com/office/drawing/2015/9/8/chartex" xmlns:cx2="http://schemas.microsoft.com/office/drawing/2015/10/21/chartex" xmlns:cx3="http://schemas.microsoft.com/office/drawing/2016/5/9/chartex" xmlns:cx4="http://schemas.microsoft.com/office/drawing/2016/5/10/chartex" xmlns:cx5="http://schemas.microsoft.com/office/drawing/2016/5/11/chartex" xmlns:cx6="http://schemas.microsoft.com/office/drawing/2016/5/12/chartex" xmlns:cx7="http://schemas.microsoft.com/office/drawing/2016/5/13/chartex" xmlns:cx8="http://schemas.microsoft.com/office/drawing/2016/5/14/chartex" xmlns:mc="http://schemas.openxmlformats.org/markup-compatibility/2006" xmlns:aink="http://schemas.microsoft.com/office/drawing/2016/ink" xmlns:am3d="http://schemas.microsoft.com/office/drawing/2017/model3d" xmlns:o="urn:schemas-microsoft-com:office:office" xmlns:oel="http://schemas.microsoft.com/office/2019/extlst" xmlns:r="http://schemas.openxmlformats.org/officeDocument/2006/relationships" xmlns:m="http://schemas.openxmlformats.org/officeDocument/2006/math" xmlns:v="urn:schemas-microsoft-com:vml" xmlns:wp14="http://schemas.microsoft.com/office/word/2010/wordprocessingDrawing" xmlns:wp="http://schemas.openxmlformats.org/drawingml/2006/wordprocessingDrawing" xmlns:w10="urn:schemas-microsoft-com:office:word" xmlns:w="http://schemas.openxmlformats.org/wordprocessingml/2006/main" xmlns:w14="http://schemas.microsoft.com/office/word/2010/wordml" xmlns:w15="http://schemas.microsoft.com/office/word/2012/wordml" xmlns:w16cex="http://schemas.microsoft.com/office/word/2018/wordml/cex" xmlns:w16cid="http://schemas.microsoft.com/office/word/2016/wordml/cid" xmlns:w16="http://schemas.microsoft.com/office/word/2018/wordml" xmlns:w16du="http://schemas.microsoft.com/office/word/2023/wordml/word16du" xmlns:w16sdtdh="http://schemas.microsoft.com/office/word/2020/wordml/sdtdatahash" xmlns:w16sdtfl="http://schemas.microsoft.com/office/word/2024/wordml/sdtformatlock" xmlns:w16se="http://schemas.microsoft.com/office/word/2015/wordml/symex" xmlns:wpg="http://schemas.microsoft.com/office/word/2010/wordprocessingGroup" xmlns:wpi="http://schemas.microsoft.com/office/word/2010/wordprocessingInk" xmlns:wne="http://schemas.microsoft.com/office/word/2006/wordml" xmlns:wps="http://schemas.microsoft.com/office/word/2010/wordprocessingShape" mc:Ignorable="w14 w15 w16se w16cid w16 w16cex w16sdtdh w16sdtfl w16du wp14">
   <w:p>
     <w:pPr>
       <w:jc w:val="right"/>
@@ -741,15 +1762,12 @@
 </file>
 
 <file path=word/header2.xml><?xml version="1.0" encoding="utf-8"?>
-<w:hdr xmlns:wpc="http://schemas.microsoft.com/office/word/2010/wordprocessingCanvas" xmlns:cx="http://schemas.microsoft.com/office/drawing/2014/chartex" xmlns:cx1="http://schemas.microsoft.com/office/drawing/2015/9/8/chartex" xmlns:cx2="http://schemas.microsoft.com/office/drawing/2015/10/21/chartex" xmlns:cx3="http://schemas.microsoft.com/office/drawing/2016/5/9/chartex" xmlns:cx4="http://schemas.microsoft.com/office/drawing/2016/5/10/chartex" xmlns:cx5="http://schemas.microsoft.com/office/drawing/2016/5/11/chartex" xmlns:cx6="http://schemas.microsoft.com/office/drawing/2016/5/12/chartex" xmlns:cx7="http://schemas.microsoft.com/office/drawing/2016/5/13/chartex" xmlns:cx8="http://schemas.microsoft.com/office/drawing/2016/5/14/chartex" xmlns:mc="http://schemas.openxmlformats.org/markup-compatibility/2006" xmlns:aink="http://schemas.microsoft.com/office/drawing/2016/ink" xmlns:am3d="http://schemas.microsoft.com/office/drawing/2017/model3d" xmlns:o="urn:schemas-microsoft-com:office:office" xmlns:oel="http://schemas.microsoft.com/office/2019/extlst" xmlns:r="http://schemas.openxmlformats.org/officeDocument/2006/relationships" xmlns:m="http://schemas.openxmlformats.org/officeDocument/2006/math" xmlns:v="urn:schemas-microsoft-com:vml" xmlns:wp14="http://schemas.microsoft.com/office/word/2010/wordprocessingDrawing" xmlns:wp="http://schemas.openxmlformats.org/drawingml/2006/wordprocessingDrawing" xmlns:w10="urn:schemas-microsoft-com:office:word" xmlns:w="http://schemas.openxmlformats.org/wordprocessingml/2006/main" xmlns:w14="http://schemas.microsoft.com/office/word/2010/wordml" xmlns:w15="http://schemas.microsoft.com/office/word/2012/wordml" xmlns:w16cex="http://schemas.microsoft.com/office/word/2018/wordml/cex" xmlns:w16cid="http://schemas.microsoft.com/office/word/2016/wordml/cid" xmlns:w16="http://schemas.microsoft.com/office/word/2018/wordml" xmlns:w16sdtdh="http://schemas.microsoft.com/office/word/2020/wordml/sdtdatahash" xmlns:w16se="http://schemas.microsoft.com/office/word/2015/wordml/symex" xmlns:wpg="http://schemas.microsoft.com/office/word/2010/wordprocessingGroup" xmlns:wpi="http://schemas.microsoft.com/office/word/2010/wordprocessingInk" xmlns:wne="http://schemas.microsoft.com/office/word/2006/wordml" xmlns:wps="http://schemas.microsoft.com/office/word/2010/wordprocessingShape" xmlns:a="http://schemas.openxmlformats.org/drawingml/2006/main" xmlns:pic="http://schemas.openxmlformats.org/drawingml/2006/picture" xmlns:a14="http://schemas.microsoft.com/office/drawing/2010/main" mc:Ignorable="w14 w15 w16se w16cid w16 w16cex w16sdtdh wp14">
+<w:hdr xmlns:wpc="http://schemas.microsoft.com/office/word/2010/wordprocessingCanvas" xmlns:cx="http://schemas.microsoft.com/office/drawing/2014/chartex" xmlns:cx1="http://schemas.microsoft.com/office/drawing/2015/9/8/chartex" xmlns:cx2="http://schemas.microsoft.com/office/drawing/2015/10/21/chartex" xmlns:cx3="http://schemas.microsoft.com/office/drawing/2016/5/9/chartex" xmlns:cx4="http://schemas.microsoft.com/office/drawing/2016/5/10/chartex" xmlns:cx5="http://schemas.microsoft.com/office/drawing/2016/5/11/chartex" xmlns:cx6="http://schemas.microsoft.com/office/drawing/2016/5/12/chartex" xmlns:cx7="http://schemas.microsoft.com/office/drawing/2016/5/13/chartex" xmlns:cx8="http://schemas.microsoft.com/office/drawing/2016/5/14/chartex" xmlns:mc="http://schemas.openxmlformats.org/markup-compatibility/2006" xmlns:aink="http://schemas.microsoft.com/office/drawing/2016/ink" xmlns:am3d="http://schemas.microsoft.com/office/drawing/2017/model3d" xmlns:o="urn:schemas-microsoft-com:office:office" xmlns:oel="http://schemas.microsoft.com/office/2019/extlst" xmlns:r="http://schemas.openxmlformats.org/officeDocument/2006/relationships" xmlns:m="http://schemas.openxmlformats.org/officeDocument/2006/math" xmlns:v="urn:schemas-microsoft-com:vml" xmlns:wp14="http://schemas.microsoft.com/office/word/2010/wordprocessingDrawing" xmlns:wp="http://schemas.openxmlformats.org/drawingml/2006/wordprocessingDrawing" xmlns:w10="urn:schemas-microsoft-com:office:word" xmlns:w="http://schemas.openxmlformats.org/wordprocessingml/2006/main" xmlns:w14="http://schemas.microsoft.com/office/word/2010/wordml" xmlns:w15="http://schemas.microsoft.com/office/word/2012/wordml" xmlns:w16cex="http://schemas.microsoft.com/office/word/2018/wordml/cex" xmlns:w16cid="http://schemas.microsoft.com/office/word/2016/wordml/cid" xmlns:w16="http://schemas.microsoft.com/office/word/2018/wordml" xmlns:w16du="http://schemas.microsoft.com/office/word/2023/wordml/word16du" xmlns:w16sdtdh="http://schemas.microsoft.com/office/word/2020/wordml/sdtdatahash" xmlns:w16sdtfl="http://schemas.microsoft.com/office/word/2024/wordml/sdtformatlock" xmlns:w16se="http://schemas.microsoft.com/office/word/2015/wordml/symex" xmlns:wpg="http://schemas.microsoft.com/office/word/2010/wordprocessingGroup" xmlns:wpi="http://schemas.microsoft.com/office/word/2010/wordprocessingInk" xmlns:wne="http://schemas.microsoft.com/office/word/2006/wordml" xmlns:wps="http://schemas.microsoft.com/office/word/2010/wordprocessingShape" mc:Ignorable="w14 w15 w16se w16cid w16 w16cex w16sdtdh w16sdtfl w16du wp14">
   <w:p>
     <w:pPr>
       <w:jc w:val="center"/>
     </w:pPr>
     <w:r>
-      <w:rPr>
-        <w:noProof/>
-      </w:rPr>
       <w:drawing>
         <wp:anchor distT="0" distB="0" distL="114300" distR="114300" simplePos="0" relativeHeight="251659264" behindDoc="0" locked="0" layoutInCell="1" allowOverlap="1" wp14:anchorId="75ADE80E" wp14:editId="7A25B4CF">
           <wp:simplePos x="0" y="0"/>
@@ -811,7 +1829,7 @@
 </file>
 
 <file path=word/numbering.xml><?xml version="1.0" encoding="utf-8"?>
-<w:numbering xmlns:wpc="http://schemas.microsoft.com/office/word/2010/wordprocessingCanvas" xmlns:cx="http://schemas.microsoft.com/office/drawing/2014/chartex" xmlns:cx1="http://schemas.microsoft.com/office/drawing/2015/9/8/chartex" xmlns:cx2="http://schemas.microsoft.com/office/drawing/2015/10/21/chartex" xmlns:cx3="http://schemas.microsoft.com/office/drawing/2016/5/9/chartex" xmlns:cx4="http://schemas.microsoft.com/office/drawing/2016/5/10/chartex" xmlns:cx5="http://schemas.microsoft.com/office/drawing/2016/5/11/chartex" xmlns:cx6="http://schemas.microsoft.com/office/drawing/2016/5/12/chartex" xmlns:cx7="http://schemas.microsoft.com/office/drawing/2016/5/13/chartex" xmlns:cx8="http://schemas.microsoft.com/office/drawing/2016/5/14/chartex" xmlns:mc="http://schemas.openxmlformats.org/markup-compatibility/2006" xmlns:aink="http://schemas.microsoft.com/office/drawing/2016/ink" xmlns:am3d="http://schemas.microsoft.com/office/drawing/2017/model3d" xmlns:o="urn:schemas-microsoft-com:office:office" xmlns:oel="http://schemas.microsoft.com/office/2019/extlst" xmlns:r="http://schemas.openxmlformats.org/officeDocument/2006/relationships" xmlns:m="http://schemas.openxmlformats.org/officeDocument/2006/math" xmlns:v="urn:schemas-microsoft-com:vml" xmlns:wp14="http://schemas.microsoft.com/office/word/2010/wordprocessingDrawing" xmlns:wp="http://schemas.openxmlformats.org/drawingml/2006/wordprocessingDrawing" xmlns:w10="urn:schemas-microsoft-com:office:word" xmlns:w="http://schemas.openxmlformats.org/wordprocessingml/2006/main" xmlns:w14="http://schemas.microsoft.com/office/word/2010/wordml" xmlns:w15="http://schemas.microsoft.com/office/word/2012/wordml" xmlns:w16cex="http://schemas.microsoft.com/office/word/2018/wordml/cex" xmlns:w16cid="http://schemas.microsoft.com/office/word/2016/wordml/cid" xmlns:w16="http://schemas.microsoft.com/office/word/2018/wordml" xmlns:w16sdtdh="http://schemas.microsoft.com/office/word/2020/wordml/sdtdatahash" xmlns:w16se="http://schemas.microsoft.com/office/word/2015/wordml/symex" xmlns:wpg="http://schemas.microsoft.com/office/word/2010/wordprocessingGroup" xmlns:wpi="http://schemas.microsoft.com/office/word/2010/wordprocessingInk" xmlns:wne="http://schemas.microsoft.com/office/word/2006/wordml" xmlns:wps="http://schemas.microsoft.com/office/word/2010/wordprocessingShape" mc:Ignorable="w14 w15 w16se w16cid w16 w16cex w16sdtdh wp14">
+<w:numbering xmlns:wpc="http://schemas.microsoft.com/office/word/2010/wordprocessingCanvas" xmlns:cx="http://schemas.microsoft.com/office/drawing/2014/chartex" xmlns:cx1="http://schemas.microsoft.com/office/drawing/2015/9/8/chartex" xmlns:cx2="http://schemas.microsoft.com/office/drawing/2015/10/21/chartex" xmlns:cx3="http://schemas.microsoft.com/office/drawing/2016/5/9/chartex" xmlns:cx4="http://schemas.microsoft.com/office/drawing/2016/5/10/chartex" xmlns:cx5="http://schemas.microsoft.com/office/drawing/2016/5/11/chartex" xmlns:cx6="http://schemas.microsoft.com/office/drawing/2016/5/12/chartex" xmlns:cx7="http://schemas.microsoft.com/office/drawing/2016/5/13/chartex" xmlns:cx8="http://schemas.microsoft.com/office/drawing/2016/5/14/chartex" xmlns:mc="http://schemas.openxmlformats.org/markup-compatibility/2006" xmlns:aink="http://schemas.microsoft.com/office/drawing/2016/ink" xmlns:am3d="http://schemas.microsoft.com/office/drawing/2017/model3d" xmlns:o="urn:schemas-microsoft-com:office:office" xmlns:oel="http://schemas.microsoft.com/office/2019/extlst" xmlns:r="http://schemas.openxmlformats.org/officeDocument/2006/relationships" xmlns:m="http://schemas.openxmlformats.org/officeDocument/2006/math" xmlns:v="urn:schemas-microsoft-com:vml" xmlns:wp14="http://schemas.microsoft.com/office/word/2010/wordprocessingDrawing" xmlns:wp="http://schemas.openxmlformats.org/drawingml/2006/wordprocessingDrawing" xmlns:w10="urn:schemas-microsoft-com:office:word" xmlns:w="http://schemas.openxmlformats.org/wordprocessingml/2006/main" xmlns:w14="http://schemas.microsoft.com/office/word/2010/wordml" xmlns:w15="http://schemas.microsoft.com/office/word/2012/wordml" xmlns:w16cex="http://schemas.microsoft.com/office/word/2018/wordml/cex" xmlns:w16cid="http://schemas.microsoft.com/office/word/2016/wordml/cid" xmlns:w16="http://schemas.microsoft.com/office/word/2018/wordml" xmlns:w16du="http://schemas.microsoft.com/office/word/2023/wordml/word16du" xmlns:w16sdtdh="http://schemas.microsoft.com/office/word/2020/wordml/sdtdatahash" xmlns:w16sdtfl="http://schemas.microsoft.com/office/word/2024/wordml/sdtformatlock" xmlns:w16se="http://schemas.microsoft.com/office/word/2015/wordml/symex" xmlns:wpg="http://schemas.microsoft.com/office/word/2010/wordprocessingGroup" xmlns:wpi="http://schemas.microsoft.com/office/word/2010/wordprocessingInk" xmlns:wne="http://schemas.microsoft.com/office/word/2006/wordml" xmlns:wps="http://schemas.microsoft.com/office/word/2010/wordprocessingShape" mc:Ignorable="w14 w15 w16se w16cid w16 w16cex w16sdtdh w16sdtfl w16du wp14">
   <w:abstractNum w:abstractNumId="0" w15:restartNumberingAfterBreak="0">
     <w:nsid w:val="055D69A2"/>
     <w:multiLevelType w:val="multilevel"/>
@@ -825,7 +1843,7 @@
         <w:ind w:left="720" w:hanging="360"/>
       </w:pPr>
       <w:rPr>
-        <w:rFonts w:ascii="Arial" w:hAnsi="Arial" w:eastAsia="Calibri" w:cs="Arial"/>
+        <w:rFonts w:ascii="Arial" w:eastAsia="Calibri" w:hAnsi="Arial" w:cs="Arial"/>
         <w:b/>
         <w:u w:val="none"/>
       </w:rPr>
@@ -839,7 +1857,7 @@
         <w:ind w:left="992" w:hanging="360"/>
       </w:pPr>
       <w:rPr>
-        <w:rFonts w:ascii="Arial" w:hAnsi="Arial" w:eastAsia="Arial" w:cs="Arial"/>
+        <w:rFonts w:ascii="Arial" w:eastAsia="Arial" w:hAnsi="Arial" w:cs="Arial"/>
         <w:b w:val="0"/>
         <w:u w:val="none"/>
       </w:rPr>
@@ -1060,7 +2078,7 @@
         <w:bCs w:val="0"/>
       </w:rPr>
     </w:lvl>
-    <w:lvl w:ilvl="1" w:tplc="10090019" w:tentative="1">
+    <w:lvl w:ilvl="1" w:tplc="10090019">
       <w:start w:val="1"/>
       <w:numFmt w:val="lowerLetter"/>
       <w:lvlText w:val="%2."/>
@@ -1329,11 +2347,11 @@
 </file>
 
 <file path=word/styles.xml><?xml version="1.0" encoding="utf-8"?>
-<w:styles xmlns:mc="http://schemas.openxmlformats.org/markup-compatibility/2006" xmlns:r="http://schemas.openxmlformats.org/officeDocument/2006/relationships" xmlns:w="http://schemas.openxmlformats.org/wordprocessingml/2006/main" xmlns:w14="http://schemas.microsoft.com/office/word/2010/wordml" xmlns:w15="http://schemas.microsoft.com/office/word/2012/wordml" xmlns:w16cex="http://schemas.microsoft.com/office/word/2018/wordml/cex" xmlns:w16cid="http://schemas.microsoft.com/office/word/2016/wordml/cid" xmlns:w16="http://schemas.microsoft.com/office/word/2018/wordml" xmlns:w16sdtdh="http://schemas.microsoft.com/office/word/2020/wordml/sdtdatahash" xmlns:w16se="http://schemas.microsoft.com/office/word/2015/wordml/symex" mc:Ignorable="w14 w15 w16se w16cid w16 w16cex w16sdtdh">
+<w:styles xmlns:mc="http://schemas.openxmlformats.org/markup-compatibility/2006" xmlns:r="http://schemas.openxmlformats.org/officeDocument/2006/relationships" xmlns:w="http://schemas.openxmlformats.org/wordprocessingml/2006/main" xmlns:w14="http://schemas.microsoft.com/office/word/2010/wordml" xmlns:w15="http://schemas.microsoft.com/office/word/2012/wordml" xmlns:w16cex="http://schemas.microsoft.com/office/word/2018/wordml/cex" xmlns:w16cid="http://schemas.microsoft.com/office/word/2016/wordml/cid" xmlns:w16="http://schemas.microsoft.com/office/word/2018/wordml" xmlns:w16du="http://schemas.microsoft.com/office/word/2023/wordml/word16du" xmlns:w16sdtdh="http://schemas.microsoft.com/office/word/2020/wordml/sdtdatahash" xmlns:w16sdtfl="http://schemas.microsoft.com/office/word/2024/wordml/sdtformatlock" xmlns:w16se="http://schemas.microsoft.com/office/word/2015/wordml/symex" mc:Ignorable="w14 w15 w16se w16cid w16 w16cex w16sdtdh w16sdtfl w16du">
   <w:docDefaults>
     <w:rPrDefault>
       <w:rPr>
-        <w:rFonts w:ascii="Arial" w:hAnsi="Arial" w:eastAsia="Arial" w:cs="Arial"/>
+        <w:rFonts w:ascii="Arial" w:eastAsia="Arial" w:hAnsi="Arial" w:cs="Arial"/>
         <w:sz w:val="22"/>
         <w:szCs w:val="22"/>
         <w:lang w:val="es" w:eastAsia="en-US" w:bidi="ar-SA"/>
@@ -1348,14 +2366,14 @@
   <w:latentStyles w:defLockedState="0" w:defUIPriority="99" w:defSemiHidden="0" w:defUnhideWhenUsed="0" w:defQFormat="0" w:count="376">
     <w:lsdException w:name="Normal" w:uiPriority="0" w:qFormat="1"/>
     <w:lsdException w:name="heading 1" w:uiPriority="9" w:qFormat="1"/>
-    <w:lsdException w:name="heading 2" w:uiPriority="9" w:semiHidden="1" w:unhideWhenUsed="1" w:qFormat="1"/>
-    <w:lsdException w:name="heading 3" w:uiPriority="9" w:semiHidden="1" w:unhideWhenUsed="1" w:qFormat="1"/>
-    <w:lsdException w:name="heading 4" w:uiPriority="9" w:semiHidden="1" w:unhideWhenUsed="1" w:qFormat="1"/>
-    <w:lsdException w:name="heading 5" w:uiPriority="9" w:semiHidden="1" w:unhideWhenUsed="1" w:qFormat="1"/>
-    <w:lsdException w:name="heading 6" w:uiPriority="9" w:semiHidden="1" w:unhideWhenUsed="1" w:qFormat="1"/>
-    <w:lsdException w:name="heading 7" w:uiPriority="9" w:semiHidden="1" w:unhideWhenUsed="1" w:qFormat="1"/>
-    <w:lsdException w:name="heading 8" w:uiPriority="9" w:semiHidden="1" w:unhideWhenUsed="1" w:qFormat="1"/>
-    <w:lsdException w:name="heading 9" w:uiPriority="9" w:semiHidden="1" w:unhideWhenUsed="1" w:qFormat="1"/>
+    <w:lsdException w:name="heading 2" w:semiHidden="1" w:uiPriority="9" w:unhideWhenUsed="1" w:qFormat="1"/>
+    <w:lsdException w:name="heading 3" w:semiHidden="1" w:uiPriority="9" w:unhideWhenUsed="1" w:qFormat="1"/>
+    <w:lsdException w:name="heading 4" w:semiHidden="1" w:uiPriority="9" w:unhideWhenUsed="1" w:qFormat="1"/>
+    <w:lsdException w:name="heading 5" w:semiHidden="1" w:uiPriority="9" w:unhideWhenUsed="1" w:qFormat="1"/>
+    <w:lsdException w:name="heading 6" w:semiHidden="1" w:uiPriority="9" w:unhideWhenUsed="1" w:qFormat="1"/>
+    <w:lsdException w:name="heading 7" w:semiHidden="1" w:uiPriority="9" w:unhideWhenUsed="1" w:qFormat="1"/>
+    <w:lsdException w:name="heading 8" w:semiHidden="1" w:uiPriority="9" w:unhideWhenUsed="1" w:qFormat="1"/>
+    <w:lsdException w:name="heading 9" w:semiHidden="1" w:uiPriority="9" w:unhideWhenUsed="1" w:qFormat="1"/>
     <w:lsdException w:name="index 1" w:semiHidden="1" w:unhideWhenUsed="1"/>
     <w:lsdException w:name="index 2" w:semiHidden="1" w:unhideWhenUsed="1"/>
     <w:lsdException w:name="index 3" w:semiHidden="1" w:unhideWhenUsed="1"/>
@@ -1365,22 +2383,22 @@
     <w:lsdException w:name="index 7" w:semiHidden="1" w:unhideWhenUsed="1"/>
     <w:lsdException w:name="index 8" w:semiHidden="1" w:unhideWhenUsed="1"/>
     <w:lsdException w:name="index 9" w:semiHidden="1" w:unhideWhenUsed="1"/>
-    <w:lsdException w:name="toc 1" w:uiPriority="39" w:semiHidden="1" w:unhideWhenUsed="1"/>
-    <w:lsdException w:name="toc 2" w:uiPriority="39" w:semiHidden="1" w:unhideWhenUsed="1"/>
-    <w:lsdException w:name="toc 3" w:uiPriority="39" w:semiHidden="1" w:unhideWhenUsed="1"/>
-    <w:lsdException w:name="toc 4" w:uiPriority="39" w:semiHidden="1" w:unhideWhenUsed="1"/>
-    <w:lsdException w:name="toc 5" w:uiPriority="39" w:semiHidden="1" w:unhideWhenUsed="1"/>
-    <w:lsdException w:name="toc 6" w:uiPriority="39" w:semiHidden="1" w:unhideWhenUsed="1"/>
-    <w:lsdException w:name="toc 7" w:uiPriority="39" w:semiHidden="1" w:unhideWhenUsed="1"/>
-    <w:lsdException w:name="toc 8" w:uiPriority="39" w:semiHidden="1" w:unhideWhenUsed="1"/>
-    <w:lsdException w:name="toc 9" w:uiPriority="39" w:semiHidden="1" w:unhideWhenUsed="1"/>
+    <w:lsdException w:name="toc 1" w:semiHidden="1" w:uiPriority="39" w:unhideWhenUsed="1"/>
+    <w:lsdException w:name="toc 2" w:semiHidden="1" w:uiPriority="39" w:unhideWhenUsed="1"/>
+    <w:lsdException w:name="toc 3" w:semiHidden="1" w:uiPriority="39" w:unhideWhenUsed="1"/>
+    <w:lsdException w:name="toc 4" w:semiHidden="1" w:uiPriority="39" w:unhideWhenUsed="1"/>
+    <w:lsdException w:name="toc 5" w:semiHidden="1" w:uiPriority="39" w:unhideWhenUsed="1"/>
+    <w:lsdException w:name="toc 6" w:semiHidden="1" w:uiPriority="39" w:unhideWhenUsed="1"/>
+    <w:lsdException w:name="toc 7" w:semiHidden="1" w:uiPriority="39" w:unhideWhenUsed="1"/>
+    <w:lsdException w:name="toc 8" w:semiHidden="1" w:uiPriority="39" w:unhideWhenUsed="1"/>
+    <w:lsdException w:name="toc 9" w:semiHidden="1" w:uiPriority="39" w:unhideWhenUsed="1"/>
     <w:lsdException w:name="Normal Indent" w:semiHidden="1" w:unhideWhenUsed="1"/>
     <w:lsdException w:name="footnote text" w:semiHidden="1" w:unhideWhenUsed="1"/>
     <w:lsdException w:name="annotation text" w:semiHidden="1" w:unhideWhenUsed="1"/>
     <w:lsdException w:name="header" w:semiHidden="1" w:unhideWhenUsed="1"/>
     <w:lsdException w:name="footer" w:semiHidden="1" w:unhideWhenUsed="1"/>
     <w:lsdException w:name="index heading" w:semiHidden="1" w:unhideWhenUsed="1"/>
-    <w:lsdException w:name="caption" w:uiPriority="35" w:semiHidden="1" w:unhideWhenUsed="1" w:qFormat="1"/>
+    <w:lsdException w:name="caption" w:semiHidden="1" w:uiPriority="35" w:unhideWhenUsed="1" w:qFormat="1"/>
     <w:lsdException w:name="table of figures" w:semiHidden="1" w:unhideWhenUsed="1"/>
     <w:lsdException w:name="envelope address" w:semiHidden="1" w:unhideWhenUsed="1"/>
     <w:lsdException w:name="envelope return" w:semiHidden="1" w:unhideWhenUsed="1"/>
@@ -1411,7 +2429,7 @@
     <w:lsdException w:name="Title" w:uiPriority="10" w:qFormat="1"/>
     <w:lsdException w:name="Closing" w:semiHidden="1" w:unhideWhenUsed="1"/>
     <w:lsdException w:name="Signature" w:semiHidden="1" w:unhideWhenUsed="1"/>
-    <w:lsdException w:name="Default Paragraph Font" w:uiPriority="1" w:semiHidden="1" w:unhideWhenUsed="1"/>
+    <w:lsdException w:name="Default Paragraph Font" w:semiHidden="1" w:uiPriority="1" w:unhideWhenUsed="1"/>
     <w:lsdException w:name="Body Text" w:semiHidden="1" w:unhideWhenUsed="1"/>
     <w:lsdException w:name="Body Text Indent" w:semiHidden="1" w:unhideWhenUsed="1"/>
     <w:lsdException w:name="List Continue" w:semiHidden="1" w:unhideWhenUsed="1"/>
@@ -1611,8 +2629,8 @@
     <w:lsdException w:name="Subtle Reference" w:uiPriority="31" w:qFormat="1"/>
     <w:lsdException w:name="Intense Reference" w:uiPriority="32" w:qFormat="1"/>
     <w:lsdException w:name="Book Title" w:uiPriority="33" w:qFormat="1"/>
-    <w:lsdException w:name="Bibliography" w:uiPriority="37" w:semiHidden="1" w:unhideWhenUsed="1"/>
-    <w:lsdException w:name="TOC Heading" w:uiPriority="39" w:semiHidden="1" w:unhideWhenUsed="1" w:qFormat="1"/>
+    <w:lsdException w:name="Bibliography" w:semiHidden="1" w:uiPriority="37" w:unhideWhenUsed="1"/>
+    <w:lsdException w:name="TOC Heading" w:semiHidden="1" w:uiPriority="39" w:unhideWhenUsed="1" w:qFormat="1"/>
     <w:lsdException w:name="Plain Table 1" w:uiPriority="41"/>
     <w:lsdException w:name="Plain Table 2" w:uiPriority="42"/>
     <w:lsdException w:name="Plain Table 3" w:uiPriority="43"/>
@@ -1723,9 +2741,12 @@
     <w:lsdException w:name="Unresolved Mention" w:semiHidden="1" w:unhideWhenUsed="1"/>
     <w:lsdException w:name="Smart Link" w:semiHidden="1" w:unhideWhenUsed="1"/>
   </w:latentStyles>
-  <w:style w:type="paragraph" w:styleId="Normal" w:default="1">
+  <w:style w:type="paragraph" w:default="1" w:styleId="Normal">
     <w:name w:val="Normal"/>
     <w:qFormat/>
+    <w:rPr>
+      <w:lang w:val="en-CA"/>
+    </w:rPr>
   </w:style>
   <w:style w:type="paragraph" w:styleId="Heading1">
     <w:name w:val="heading 1"/>
@@ -1840,13 +2861,12 @@
       <w:color w:val="666666"/>
     </w:rPr>
   </w:style>
-  <w:style w:type="character" w:styleId="DefaultParagraphFont" w:default="1">
+  <w:style w:type="character" w:default="1" w:styleId="DefaultParagraphFont">
     <w:name w:val="Default Paragraph Font"/>
     <w:uiPriority w:val="1"/>
-    <w:semiHidden/>
     <w:unhideWhenUsed/>
   </w:style>
-  <w:style w:type="table" w:styleId="TableNormal" w:default="1">
+  <w:style w:type="table" w:default="1" w:styleId="TableNormal">
     <w:name w:val="Normal Table"/>
     <w:uiPriority w:val="99"/>
     <w:semiHidden/>
@@ -1861,7 +2881,7 @@
       </w:tblCellMar>
     </w:tblPr>
   </w:style>
-  <w:style w:type="numbering" w:styleId="NoList" w:default="1">
+  <w:style w:type="numbering" w:default="1" w:styleId="NoList">
     <w:name w:val="No List"/>
     <w:uiPriority w:val="99"/>
     <w:semiHidden/>
@@ -1915,7 +2935,7 @@
       <w:spacing w:line="240" w:lineRule="auto"/>
     </w:pPr>
   </w:style>
-  <w:style w:type="character" w:styleId="HeaderChar" w:customStyle="1">
+  <w:style w:type="character" w:customStyle="1" w:styleId="HeaderChar">
     <w:name w:val="Header Char"/>
     <w:basedOn w:val="DefaultParagraphFont"/>
     <w:link w:val="Header"/>
@@ -1937,7 +2957,7 @@
       <w:spacing w:line="240" w:lineRule="auto"/>
     </w:pPr>
   </w:style>
-  <w:style w:type="character" w:styleId="FooterChar" w:customStyle="1">
+  <w:style w:type="character" w:customStyle="1" w:styleId="FooterChar">
     <w:name w:val="Footer Char"/>
     <w:basedOn w:val="DefaultParagraphFont"/>
     <w:link w:val="Footer"/>
@@ -1954,6 +2974,29 @@
       <w:ind w:left="720"/>
       <w:contextualSpacing/>
     </w:pPr>
+  </w:style>
+  <w:style w:type="character" w:styleId="Hyperlink">
+    <w:name w:val="Hyperlink"/>
+    <w:basedOn w:val="DefaultParagraphFont"/>
+    <w:uiPriority w:val="99"/>
+    <w:unhideWhenUsed/>
+    <w:rsid w:val="00595FF6"/>
+    <w:rPr>
+      <w:color w:val="0000FF" w:themeColor="hyperlink"/>
+      <w:u w:val="single"/>
+    </w:rPr>
+  </w:style>
+  <w:style w:type="character" w:styleId="UnresolvedMention">
+    <w:name w:val="Unresolved Mention"/>
+    <w:basedOn w:val="DefaultParagraphFont"/>
+    <w:uiPriority w:val="99"/>
+    <w:semiHidden/>
+    <w:unhideWhenUsed/>
+    <w:rsid w:val="00595FF6"/>
+    <w:rPr>
+      <w:color w:val="605E5C"/>
+      <w:shd w:val="clear" w:color="auto" w:fill="E1DFDD"/>
+    </w:rPr>
   </w:style>
 </w:styles>
 </file>

</xml_diff>

<commit_message>
Added pdf of slides.
</commit_message>
<xml_diff>
--- a/Outline/IntroToHPCWorkshopOutline.docx
+++ b/Outline/IntroToHPCWorkshopOutline.docx
@@ -83,6 +83,23 @@
         </w:rPr>
         <w:t xml:space="preserve">Registration link: </w:t>
       </w:r>
+      <w:hyperlink r:id="rId7" w:history="1">
+        <w:r>
+          <w:rPr>
+            <w:rStyle w:val="Hyperlink"/>
+            <w:rFonts w:eastAsia="Calibri"/>
+          </w:rPr>
+          <w:t>https://forms.cloud.microsoft/r/xJjdKkVTUC</w:t>
+        </w:r>
+      </w:hyperlink>
+      <w:r>
+        <w:rPr>
+          <w:rFonts w:eastAsia="Calibri"/>
+          <w:b/>
+          <w:bCs/>
+        </w:rPr>
+        <w:t xml:space="preserve"> </w:t>
+      </w:r>
     </w:p>
     <w:p>
       <w:pPr>
@@ -142,7 +159,48 @@
         <w:rPr>
           <w:rFonts w:eastAsia="Calibri"/>
         </w:rPr>
-        <w:t>A Digital Research Alliance of Canada account</w:t>
+        <w:t xml:space="preserve">A </w:t>
+      </w:r>
+      <w:hyperlink r:id="rId8" w:history="1">
+        <w:r>
+          <w:rPr>
+            <w:rStyle w:val="Hyperlink"/>
+            <w:rFonts w:eastAsia="Calibri"/>
+          </w:rPr>
+          <w:t>Digital Research Alliance of Canada account</w:t>
+        </w:r>
+      </w:hyperlink>
+      <w:r>
+        <w:rPr>
+          <w:rFonts w:eastAsia="Calibri"/>
+        </w:rPr>
+        <w:t xml:space="preserve"> and access to one of their </w:t>
+      </w:r>
+      <w:r>
+        <w:rPr>
+          <w:rFonts w:eastAsia="Calibri"/>
+        </w:rPr>
+        <w:t>general-purpose</w:t>
+      </w:r>
+      <w:r>
+        <w:rPr>
+          <w:rFonts w:eastAsia="Calibri"/>
+        </w:rPr>
+        <w:t xml:space="preserve"> clusters (Fir, </w:t>
+      </w:r>
+      <w:proofErr w:type="spellStart"/>
+      <w:r>
+        <w:rPr>
+          <w:rFonts w:eastAsia="Calibri"/>
+        </w:rPr>
+        <w:t>Narval</w:t>
+      </w:r>
+      <w:proofErr w:type="spellEnd"/>
+      <w:r>
+        <w:rPr>
+          <w:rFonts w:eastAsia="Calibri"/>
+        </w:rPr>
+        <w:t>, Nibi, or Rorqual)</w:t>
       </w:r>
     </w:p>
     <w:p>
@@ -155,6 +213,72 @@
         <w:spacing w:line="360" w:lineRule="auto"/>
         <w:rPr>
           <w:rFonts w:eastAsia="Calibri"/>
+        </w:rPr>
+      </w:pPr>
+      <w:r>
+        <w:rPr>
+          <w:rFonts w:eastAsia="Calibri"/>
+        </w:rPr>
+        <w:t>A terminal (</w:t>
+      </w:r>
+      <w:r>
+        <w:rPr>
+          <w:rFonts w:eastAsia="Calibri"/>
+        </w:rPr>
+        <w:t xml:space="preserve">Mac OS and any </w:t>
+      </w:r>
+      <w:proofErr w:type="spellStart"/>
+      <w:r>
+        <w:rPr>
+          <w:rFonts w:eastAsia="Calibri"/>
+        </w:rPr>
+        <w:t>linux</w:t>
+      </w:r>
+      <w:proofErr w:type="spellEnd"/>
+      <w:r>
+        <w:rPr>
+          <w:rFonts w:eastAsia="Calibri"/>
+        </w:rPr>
+        <w:t xml:space="preserve"> distribution will have a terminal already</w:t>
+      </w:r>
+      <w:r>
+        <w:rPr>
+          <w:rFonts w:eastAsia="Calibri"/>
+        </w:rPr>
+        <w:t xml:space="preserve"> but </w:t>
+      </w:r>
+      <w:r>
+        <w:rPr>
+          <w:rFonts w:eastAsia="Calibri"/>
+        </w:rPr>
+        <w:t xml:space="preserve">Windows users must download their own </w:t>
+      </w:r>
+      <w:hyperlink r:id="rId9" w:anchor="1-overview" w:history="1">
+        <w:r>
+          <w:rPr>
+            <w:rStyle w:val="Hyperlink"/>
+            <w:rFonts w:eastAsia="Calibri"/>
+          </w:rPr>
+          <w:t>terminal</w:t>
+        </w:r>
+      </w:hyperlink>
+      <w:r>
+        <w:rPr>
+          <w:rFonts w:eastAsia="Calibri"/>
+        </w:rPr>
+        <w:t>)</w:t>
+      </w:r>
+    </w:p>
+    <w:p>
+      <w:pPr>
+        <w:pStyle w:val="ListParagraph"/>
+        <w:numPr>
+          <w:ilvl w:val="0"/>
+          <w:numId w:val="4"/>
+        </w:numPr>
+        <w:spacing w:line="360" w:lineRule="auto"/>
+        <w:rPr>
+          <w:rFonts w:eastAsia="Calibri"/>
           <w:b/>
           <w:bCs/>
         </w:rPr>
@@ -165,7 +289,7 @@
         </w:rPr>
         <w:t xml:space="preserve">The </w:t>
       </w:r>
-      <w:hyperlink r:id="rId7" w:anchor="download-duo-mobile" w:history="1">
+      <w:hyperlink r:id="rId10" w:anchor="download-duo-mobile" w:history="1">
         <w:r>
           <w:rPr>
             <w:rStyle w:val="Hyperlink"/>
@@ -195,7 +319,7 @@
           <w:bCs/>
         </w:rPr>
       </w:pPr>
-      <w:hyperlink r:id="rId8" w:history="1">
+      <w:hyperlink r:id="rId11" w:history="1">
         <w:r>
           <w:rPr>
             <w:rStyle w:val="Hyperlink"/>
@@ -224,7 +348,7 @@
       <w:r>
         <w:t xml:space="preserve">A code editor (The workshop lead will be using </w:t>
       </w:r>
-      <w:hyperlink r:id="rId9" w:history="1">
+      <w:hyperlink r:id="rId12" w:history="1">
         <w:r>
           <w:rPr>
             <w:rStyle w:val="Hyperlink"/>
@@ -350,7 +474,19 @@
         <w:rPr>
           <w:rFonts w:eastAsia="Calibri"/>
         </w:rPr>
-        <w:t xml:space="preserve">rom organizing and uploading your data and code to submitting jobs, troubleshooting common errors, and optimizing your workflow for efficient computing. </w:t>
+        <w:t xml:space="preserve">rom organizing and uploading your data and code to submitting jobs, </w:t>
+      </w:r>
+      <w:r>
+        <w:rPr>
+          <w:rFonts w:eastAsia="Calibri"/>
+        </w:rPr>
+        <w:t xml:space="preserve">and </w:t>
+      </w:r>
+      <w:r>
+        <w:rPr>
+          <w:rFonts w:eastAsia="Calibri"/>
+        </w:rPr>
+        <w:t xml:space="preserve">troubleshooting common errors. </w:t>
       </w:r>
     </w:p>
     <w:p>
@@ -558,45 +694,6 @@
     <w:p>
       <w:pPr>
         <w:pStyle w:val="ListParagraph"/>
-        <w:numPr>
-          <w:ilvl w:val="0"/>
-          <w:numId w:val="5"/>
-        </w:numPr>
-        <w:spacing w:after="200" w:line="263" w:lineRule="auto"/>
-        <w:rPr>
-          <w:rFonts w:eastAsia="Calibri"/>
-          <w:b/>
-          <w:bCs/>
-        </w:rPr>
-      </w:pPr>
-      <w:r>
-        <w:rPr>
-          <w:rFonts w:eastAsia="Calibri"/>
-        </w:rPr>
-        <w:t>O</w:t>
-      </w:r>
-      <w:r>
-        <w:rPr>
-          <w:rFonts w:eastAsia="Calibri"/>
-        </w:rPr>
-        <w:t>ptimize local code for efficient use of</w:t>
-      </w:r>
-      <w:r>
-        <w:rPr>
-          <w:rFonts w:eastAsia="Calibri"/>
-        </w:rPr>
-        <w:t xml:space="preserve"> </w:t>
-      </w:r>
-      <w:r>
-        <w:rPr>
-          <w:rFonts w:eastAsia="Calibri"/>
-        </w:rPr>
-        <w:t>DRAC</w:t>
-      </w:r>
-    </w:p>
-    <w:p>
-      <w:pPr>
-        <w:pStyle w:val="ListParagraph"/>
         <w:spacing w:after="200" w:line="263" w:lineRule="auto"/>
         <w:rPr>
           <w:rFonts w:eastAsia="Calibri"/>
@@ -657,6 +754,14 @@
           <w:b/>
           <w:bCs/>
         </w:rPr>
+        <w:t xml:space="preserve"> (DRAC)</w:t>
+      </w:r>
+      <w:r>
+        <w:rPr>
+          <w:rFonts w:eastAsia="Calibri"/>
+          <w:b/>
+          <w:bCs/>
+        </w:rPr>
         <w:t xml:space="preserve"> (</w:t>
       </w:r>
       <w:r>
@@ -665,7 +770,23 @@
           <w:b/>
           <w:bCs/>
         </w:rPr>
-        <w:t>10min</w:t>
+        <w:t>1</w:t>
+      </w:r>
+      <w:r>
+        <w:rPr>
+          <w:rFonts w:eastAsia="Calibri"/>
+          <w:b/>
+          <w:bCs/>
+        </w:rPr>
+        <w:t>5</w:t>
+      </w:r>
+      <w:r>
+        <w:rPr>
+          <w:rFonts w:eastAsia="Calibri"/>
+          <w:b/>
+          <w:bCs/>
+        </w:rPr>
+        <w:t>min</w:t>
       </w:r>
       <w:r>
         <w:rPr>
@@ -728,6 +849,7 @@
         <w:rPr>
           <w:rFonts w:eastAsia="Calibri"/>
         </w:rPr>
+        <w:lastRenderedPageBreak/>
         <w:t xml:space="preserve">Workflow description of how you interact </w:t>
       </w:r>
       <w:r>
@@ -758,14 +880,25 @@
         <w:rPr>
           <w:rFonts w:eastAsia="Calibri"/>
         </w:rPr>
-        <w:lastRenderedPageBreak/>
         <w:t>Hands-on activity</w:t>
       </w:r>
       <w:r>
         <w:rPr>
           <w:rFonts w:eastAsia="Calibri"/>
         </w:rPr>
-        <w:t>: Workflow understanding quiz</w:t>
+        <w:t xml:space="preserve">: </w:t>
+      </w:r>
+      <w:r>
+        <w:rPr>
+          <w:rFonts w:eastAsia="Calibri"/>
+        </w:rPr>
+        <w:t xml:space="preserve">DRAC </w:t>
+      </w:r>
+      <w:r>
+        <w:rPr>
+          <w:rFonts w:eastAsia="Calibri"/>
+        </w:rPr>
+        <w:t>Workflow understanding quiz</w:t>
       </w:r>
       <w:r>
         <w:rPr>
@@ -777,7 +910,13 @@
         <w:rPr>
           <w:rFonts w:eastAsia="Calibri"/>
         </w:rPr>
-        <w:t>3min</w:t>
+        <w:t>5</w:t>
+      </w:r>
+      <w:r>
+        <w:rPr>
+          <w:rFonts w:eastAsia="Calibri"/>
+        </w:rPr>
+        <w:t>min</w:t>
       </w:r>
       <w:r>
         <w:rPr>
@@ -817,7 +956,24 @@
           <w:b/>
           <w:bCs/>
         </w:rPr>
-        <w:t xml:space="preserve">II: Preparing your local data and code for high-performance computing </w:t>
+        <w:t xml:space="preserve">II: </w:t>
+      </w:r>
+      <w:r>
+        <w:rPr>
+          <w:rFonts w:eastAsia="Calibri"/>
+          <w:b/>
+          <w:bCs/>
+          <w:lang w:val="en-US"/>
+        </w:rPr>
+        <w:t>Preparing Your Data and Code for DRAC</w:t>
+      </w:r>
+      <w:r>
+        <w:rPr>
+          <w:rFonts w:eastAsia="Calibri"/>
+          <w:b/>
+          <w:bCs/>
+        </w:rPr>
+        <w:t xml:space="preserve"> </w:t>
       </w:r>
       <w:r>
         <w:rPr>
@@ -833,7 +989,7 @@
           <w:b/>
           <w:bCs/>
         </w:rPr>
-        <w:t>20</w:t>
+        <w:t>30</w:t>
       </w:r>
       <w:r>
         <w:rPr>
@@ -867,7 +1023,91 @@
         <w:rPr>
           <w:rFonts w:eastAsia="Calibri"/>
         </w:rPr>
-        <w:t>Data and code organization best practices</w:t>
+        <w:t>B</w:t>
+      </w:r>
+      <w:r>
+        <w:rPr>
+          <w:rFonts w:eastAsia="Calibri"/>
+        </w:rPr>
+        <w:t>est practices</w:t>
+      </w:r>
+      <w:r>
+        <w:rPr>
+          <w:rFonts w:eastAsia="Calibri"/>
+        </w:rPr>
+        <w:t xml:space="preserve"> for preparing your data and code to be run on DRAC</w:t>
+      </w:r>
+    </w:p>
+    <w:p>
+      <w:pPr>
+        <w:numPr>
+          <w:ilvl w:val="1"/>
+          <w:numId w:val="2"/>
+        </w:numPr>
+        <w:spacing w:line="360" w:lineRule="auto"/>
+        <w:rPr>
+          <w:rFonts w:eastAsia="Calibri"/>
+        </w:rPr>
+      </w:pPr>
+      <w:r>
+        <w:rPr>
+          <w:rFonts w:eastAsia="Calibri"/>
+        </w:rPr>
+        <w:t>Introduction to DRAC’s file transfer system (Globus)</w:t>
+      </w:r>
+    </w:p>
+    <w:p>
+      <w:pPr>
+        <w:numPr>
+          <w:ilvl w:val="1"/>
+          <w:numId w:val="2"/>
+        </w:numPr>
+        <w:spacing w:line="360" w:lineRule="auto"/>
+        <w:rPr>
+          <w:rFonts w:eastAsia="Calibri"/>
+        </w:rPr>
+      </w:pPr>
+      <w:r>
+        <w:rPr>
+          <w:rFonts w:eastAsia="Calibri"/>
+        </w:rPr>
+        <w:t>Hands-on activity</w:t>
+      </w:r>
+      <w:r>
+        <w:rPr>
+          <w:rFonts w:eastAsia="Calibri"/>
+        </w:rPr>
+        <w:t xml:space="preserve">: Upload workshop data and code to DRAC using Globus Personal Connect </w:t>
+      </w:r>
+      <w:r>
+        <w:rPr>
+          <w:rFonts w:eastAsia="Calibri"/>
+        </w:rPr>
+        <w:t>(</w:t>
+      </w:r>
+      <w:r>
+        <w:rPr>
+          <w:rFonts w:eastAsia="Calibri"/>
+        </w:rPr>
+        <w:t>2</w:t>
+      </w:r>
+      <w:r>
+        <w:rPr>
+          <w:rFonts w:eastAsia="Calibri"/>
+        </w:rPr>
+        <w:t>5</w:t>
+      </w:r>
+      <w:r>
+        <w:rPr>
+          <w:rFonts w:eastAsia="Calibri"/>
+        </w:rPr>
+        <w:t>min</w:t>
+      </w:r>
+      <w:r>
+        <w:rPr>
+          <w:rFonts w:eastAsia="Calibri"/>
+        </w:rPr>
+        <w:t>)</w:t>
       </w:r>
     </w:p>
     <w:p>
@@ -885,7 +1125,7 @@
         <w:rPr>
           <w:rFonts w:eastAsia="Calibri"/>
         </w:rPr>
-        <w:t>Folder organization</w:t>
+        <w:t>Uploading files to DRAC</w:t>
       </w:r>
     </w:p>
     <w:p>
@@ -903,7 +1143,109 @@
         <w:rPr>
           <w:rFonts w:eastAsia="Calibri"/>
         </w:rPr>
-        <w:t>Debugging locally</w:t>
+        <w:t xml:space="preserve">Navigating folders with </w:t>
+      </w:r>
+      <w:proofErr w:type="spellStart"/>
+      <w:r>
+        <w:rPr>
+          <w:rFonts w:eastAsia="Calibri"/>
+        </w:rPr>
+        <w:t>linux</w:t>
+      </w:r>
+      <w:proofErr w:type="spellEnd"/>
+    </w:p>
+    <w:p>
+      <w:pPr>
+        <w:spacing w:line="360" w:lineRule="auto"/>
+        <w:rPr>
+          <w:rFonts w:eastAsia="Calibri"/>
+        </w:rPr>
+      </w:pPr>
+    </w:p>
+    <w:p>
+      <w:pPr>
+        <w:numPr>
+          <w:ilvl w:val="0"/>
+          <w:numId w:val="2"/>
+        </w:numPr>
+        <w:spacing w:line="360" w:lineRule="auto"/>
+        <w:rPr>
+          <w:rFonts w:eastAsia="Calibri"/>
+          <w:b/>
+          <w:bCs/>
+        </w:rPr>
+      </w:pPr>
+      <w:r>
+        <w:rPr>
+          <w:rFonts w:eastAsia="Calibri"/>
+          <w:b/>
+          <w:bCs/>
+        </w:rPr>
+        <w:t xml:space="preserve">Module </w:t>
+      </w:r>
+      <w:r>
+        <w:rPr>
+          <w:rFonts w:eastAsia="Calibri"/>
+          <w:b/>
+          <w:bCs/>
+        </w:rPr>
+        <w:t>I</w:t>
+      </w:r>
+      <w:r>
+        <w:rPr>
+          <w:rFonts w:eastAsia="Calibri"/>
+          <w:b/>
+          <w:bCs/>
+        </w:rPr>
+        <w:t>II</w:t>
+      </w:r>
+      <w:r>
+        <w:rPr>
+          <w:rFonts w:eastAsia="Calibri"/>
+          <w:b/>
+          <w:bCs/>
+        </w:rPr>
+        <w:t xml:space="preserve">: </w:t>
+      </w:r>
+      <w:r>
+        <w:rPr>
+          <w:rFonts w:eastAsia="Calibri"/>
+          <w:b/>
+          <w:bCs/>
+        </w:rPr>
+        <w:t>Running a Job on DRAC</w:t>
+      </w:r>
+      <w:r>
+        <w:rPr>
+          <w:rFonts w:eastAsia="Calibri"/>
+          <w:b/>
+          <w:bCs/>
+        </w:rPr>
+        <w:t xml:space="preserve"> </w:t>
+      </w:r>
+      <w:r>
+        <w:rPr>
+          <w:rFonts w:eastAsia="Calibri"/>
+          <w:b/>
+          <w:bCs/>
+        </w:rPr>
+        <w:t>(</w:t>
+      </w:r>
+      <w:r>
+        <w:rPr>
+          <w:rFonts w:eastAsia="Calibri"/>
+          <w:b/>
+          <w:bCs/>
+        </w:rPr>
+        <w:t>30</w:t>
+      </w:r>
+      <w:r>
+        <w:rPr>
+          <w:rFonts w:eastAsia="Calibri"/>
+          <w:b/>
+          <w:bCs/>
+        </w:rPr>
+        <w:t>min)</w:t>
       </w:r>
     </w:p>
     <w:p>
@@ -921,7 +1263,45 @@
         <w:rPr>
           <w:rFonts w:eastAsia="Calibri"/>
         </w:rPr>
-        <w:t>How to communicate your computational needs to the high-performance computing system</w:t>
+        <w:t>DRAC’s file system manager (</w:t>
+      </w:r>
+      <w:proofErr w:type="spellStart"/>
+      <w:r>
+        <w:rPr>
+          <w:rFonts w:eastAsia="Calibri"/>
+        </w:rPr>
+        <w:t>slurm</w:t>
+      </w:r>
+      <w:proofErr w:type="spellEnd"/>
+      <w:r>
+        <w:rPr>
+          <w:rFonts w:eastAsia="Calibri"/>
+        </w:rPr>
+        <w:t>)</w:t>
+      </w:r>
+    </w:p>
+    <w:p>
+      <w:pPr>
+        <w:numPr>
+          <w:ilvl w:val="1"/>
+          <w:numId w:val="2"/>
+        </w:numPr>
+        <w:spacing w:line="360" w:lineRule="auto"/>
+        <w:rPr>
+          <w:rFonts w:eastAsia="Calibri"/>
+        </w:rPr>
+      </w:pPr>
+      <w:r>
+        <w:rPr>
+          <w:rFonts w:eastAsia="Calibri"/>
+        </w:rPr>
+        <w:t xml:space="preserve">How to communicate your computational needs to </w:t>
+      </w:r>
+      <w:r>
+        <w:rPr>
+          <w:rFonts w:eastAsia="Calibri"/>
+        </w:rPr>
+        <w:t>DRAC</w:t>
       </w:r>
     </w:p>
     <w:p>
@@ -975,13 +1355,61 @@
         <w:rPr>
           <w:rFonts w:eastAsia="Calibri"/>
         </w:rPr>
+        <w:t>How to “submit a job”</w:t>
+      </w:r>
+    </w:p>
+    <w:p>
+      <w:pPr>
+        <w:numPr>
+          <w:ilvl w:val="1"/>
+          <w:numId w:val="2"/>
+        </w:numPr>
+        <w:spacing w:line="360" w:lineRule="auto"/>
+        <w:rPr>
+          <w:rFonts w:eastAsia="Calibri"/>
+        </w:rPr>
+      </w:pPr>
+      <w:r>
+        <w:rPr>
+          <w:rFonts w:eastAsia="Calibri"/>
+        </w:rPr>
+        <w:t>How to check on the status of your job</w:t>
+      </w:r>
+    </w:p>
+    <w:p>
+      <w:pPr>
+        <w:numPr>
+          <w:ilvl w:val="1"/>
+          <w:numId w:val="2"/>
+        </w:numPr>
+        <w:spacing w:line="360" w:lineRule="auto"/>
+        <w:rPr>
+          <w:rFonts w:eastAsia="Calibri"/>
+        </w:rPr>
+      </w:pPr>
+      <w:r>
+        <w:rPr>
+          <w:rFonts w:eastAsia="Calibri"/>
+        </w:rPr>
         <w:t>Hands-on activity</w:t>
       </w:r>
       <w:r>
         <w:rPr>
           <w:rFonts w:eastAsia="Calibri"/>
         </w:rPr>
-        <w:t xml:space="preserve">: Editing job script template for personal use </w:t>
+        <w:t xml:space="preserve">: </w:t>
+      </w:r>
+      <w:r>
+        <w:rPr>
+          <w:rFonts w:eastAsia="Calibri"/>
+        </w:rPr>
+        <w:t>Submit a job</w:t>
+      </w:r>
+      <w:r>
+        <w:rPr>
+          <w:rFonts w:eastAsia="Calibri"/>
+        </w:rPr>
+        <w:t xml:space="preserve"> to DRAC </w:t>
       </w:r>
       <w:r>
         <w:rPr>
@@ -993,7 +1421,7 @@
         <w:rPr>
           <w:rFonts w:eastAsia="Calibri"/>
         </w:rPr>
-        <w:t>10</w:t>
+        <w:t>20</w:t>
       </w:r>
       <w:r>
         <w:rPr>
@@ -1049,39 +1477,23 @@
           <w:b/>
           <w:bCs/>
         </w:rPr>
-        <w:t xml:space="preserve">II: </w:t>
-      </w:r>
-      <w:r>
-        <w:rPr>
-          <w:rFonts w:eastAsia="Calibri"/>
-          <w:b/>
-          <w:bCs/>
-        </w:rPr>
-        <w:t xml:space="preserve">Uploading your data and code to </w:t>
-      </w:r>
-      <w:r>
-        <w:rPr>
-          <w:rFonts w:eastAsia="Calibri"/>
-          <w:b/>
-          <w:bCs/>
-        </w:rPr>
-        <w:t xml:space="preserve">DRAC’s </w:t>
-      </w:r>
-      <w:r>
-        <w:rPr>
-          <w:rFonts w:eastAsia="Calibri"/>
-          <w:b/>
-          <w:bCs/>
-        </w:rPr>
-        <w:t xml:space="preserve">high-performance computing </w:t>
-      </w:r>
-      <w:r>
-        <w:rPr>
-          <w:rFonts w:eastAsia="Calibri"/>
-          <w:b/>
-          <w:bCs/>
-        </w:rPr>
-        <w:t xml:space="preserve">system </w:t>
+        <w:t xml:space="preserve">V: </w:t>
+      </w:r>
+      <w:r>
+        <w:rPr>
+          <w:rFonts w:eastAsia="Calibri"/>
+          <w:b/>
+          <w:bCs/>
+        </w:rPr>
+        <w:t>Handling Job Errors</w:t>
+      </w:r>
+      <w:r>
+        <w:rPr>
+          <w:rFonts w:eastAsia="Calibri"/>
+          <w:b/>
+          <w:bCs/>
+        </w:rPr>
+        <w:t xml:space="preserve"> </w:t>
       </w:r>
       <w:r>
         <w:rPr>
@@ -1097,7 +1509,7 @@
           <w:b/>
           <w:bCs/>
         </w:rPr>
-        <w:t>15min</w:t>
+        <w:t>30min</w:t>
       </w:r>
       <w:r>
         <w:rPr>
@@ -1106,6 +1518,12 @@
           <w:bCs/>
         </w:rPr>
         <w:t>)</w:t>
+      </w:r>
+      <w:r>
+        <w:rPr>
+          <w:rFonts w:eastAsia="Calibri"/>
+        </w:rPr>
+        <w:t xml:space="preserve"> </w:t>
       </w:r>
     </w:p>
     <w:p>
@@ -1123,7 +1541,7 @@
         <w:rPr>
           <w:rFonts w:eastAsia="Calibri"/>
         </w:rPr>
-        <w:t>Introduction to DRAC’s file transfer system (Globus)</w:t>
+        <w:t>How to use output and error files</w:t>
       </w:r>
     </w:p>
     <w:p>
@@ -1141,7 +1559,7 @@
         <w:rPr>
           <w:rFonts w:eastAsia="Calibri"/>
         </w:rPr>
-        <w:t>Alternate file transfer methods and their use cases</w:t>
+        <w:t>Common errors and their solutions</w:t>
       </w:r>
     </w:p>
     <w:p>
@@ -1159,183 +1577,7 @@
         <w:rPr>
           <w:rFonts w:eastAsia="Calibri"/>
         </w:rPr>
-        <w:t>Hands-on activity</w:t>
-      </w:r>
-      <w:r>
-        <w:rPr>
-          <w:rFonts w:eastAsia="Calibri"/>
-        </w:rPr>
-        <w:t xml:space="preserve">: </w:t>
-      </w:r>
-      <w:r>
-        <w:rPr>
-          <w:rFonts w:eastAsia="Calibri"/>
-        </w:rPr>
-        <w:t>Upload workshop data and code to DRAC using Globus Personal Connect</w:t>
-      </w:r>
-      <w:r>
-        <w:rPr>
-          <w:rFonts w:eastAsia="Calibri"/>
-        </w:rPr>
-        <w:t xml:space="preserve"> </w:t>
-      </w:r>
-      <w:r>
-        <w:rPr>
-          <w:rFonts w:eastAsia="Calibri"/>
-        </w:rPr>
-        <w:t>(</w:t>
-      </w:r>
-      <w:r>
-        <w:rPr>
-          <w:rFonts w:eastAsia="Calibri"/>
-        </w:rPr>
-        <w:t>10</w:t>
-      </w:r>
-      <w:r>
-        <w:rPr>
-          <w:rFonts w:eastAsia="Calibri"/>
-        </w:rPr>
-        <w:t>min</w:t>
-      </w:r>
-      <w:r>
-        <w:rPr>
-          <w:rFonts w:eastAsia="Calibri"/>
-        </w:rPr>
-        <w:t>)</w:t>
-      </w:r>
-    </w:p>
-    <w:p>
-      <w:pPr>
-        <w:numPr>
-          <w:ilvl w:val="2"/>
-          <w:numId w:val="2"/>
-        </w:numPr>
-        <w:spacing w:line="360" w:lineRule="auto"/>
-        <w:rPr>
-          <w:rFonts w:eastAsia="Calibri"/>
-        </w:rPr>
-      </w:pPr>
-      <w:r>
-        <w:rPr>
-          <w:rFonts w:eastAsia="Calibri"/>
-        </w:rPr>
-        <w:t>Practice basic command line navigation commands (cd, ls, etc.) to confirm file transfer success</w:t>
-      </w:r>
-    </w:p>
-    <w:p>
-      <w:pPr>
-        <w:spacing w:line="360" w:lineRule="auto"/>
-        <w:rPr>
-          <w:rFonts w:eastAsia="Calibri"/>
-        </w:rPr>
-      </w:pPr>
-    </w:p>
-    <w:p>
-      <w:pPr>
-        <w:numPr>
-          <w:ilvl w:val="0"/>
-          <w:numId w:val="2"/>
-        </w:numPr>
-        <w:spacing w:line="360" w:lineRule="auto"/>
-        <w:rPr>
-          <w:rFonts w:eastAsia="Calibri"/>
-        </w:rPr>
-      </w:pPr>
-      <w:r>
-        <w:rPr>
-          <w:rFonts w:eastAsia="Calibri"/>
-          <w:b/>
-          <w:bCs/>
-        </w:rPr>
-        <w:t xml:space="preserve">Module </w:t>
-      </w:r>
-      <w:r>
-        <w:rPr>
-          <w:rFonts w:eastAsia="Calibri"/>
-          <w:b/>
-          <w:bCs/>
-        </w:rPr>
-        <w:t>I</w:t>
-      </w:r>
-      <w:r>
-        <w:rPr>
-          <w:rFonts w:eastAsia="Calibri"/>
-          <w:b/>
-          <w:bCs/>
-        </w:rPr>
-        <w:t>V</w:t>
-      </w:r>
-      <w:r>
-        <w:rPr>
-          <w:rFonts w:eastAsia="Calibri"/>
-          <w:b/>
-          <w:bCs/>
-        </w:rPr>
-        <w:t xml:space="preserve">: </w:t>
-      </w:r>
-      <w:r>
-        <w:rPr>
-          <w:rFonts w:eastAsia="Calibri"/>
-          <w:b/>
-          <w:bCs/>
-        </w:rPr>
-        <w:t>Running your</w:t>
-      </w:r>
-      <w:r>
-        <w:rPr>
-          <w:rFonts w:eastAsia="Calibri"/>
-          <w:b/>
-          <w:bCs/>
-        </w:rPr>
-        <w:t xml:space="preserve"> code </w:t>
-      </w:r>
-      <w:r>
-        <w:rPr>
-          <w:rFonts w:eastAsia="Calibri"/>
-          <w:b/>
-          <w:bCs/>
-        </w:rPr>
-        <w:t>using</w:t>
-      </w:r>
-      <w:r>
-        <w:rPr>
-          <w:rFonts w:eastAsia="Calibri"/>
-          <w:b/>
-          <w:bCs/>
-        </w:rPr>
-        <w:t xml:space="preserve"> DRAC’s high-performance computing system </w:t>
-      </w:r>
-      <w:r>
-        <w:rPr>
-          <w:rFonts w:eastAsia="Calibri"/>
-          <w:b/>
-          <w:bCs/>
-        </w:rPr>
-        <w:t>(</w:t>
-      </w:r>
-      <w:r>
-        <w:rPr>
-          <w:rFonts w:eastAsia="Calibri"/>
-          <w:b/>
-          <w:bCs/>
-        </w:rPr>
-        <w:t>30</w:t>
-      </w:r>
-      <w:r>
-        <w:rPr>
-          <w:rFonts w:eastAsia="Calibri"/>
-          <w:b/>
-          <w:bCs/>
-        </w:rPr>
-        <w:t>min</w:t>
-      </w:r>
-      <w:r>
-        <w:rPr>
-          <w:rFonts w:eastAsia="Calibri"/>
-          <w:b/>
-          <w:bCs/>
-        </w:rPr>
-        <w:t>)</w:t>
+        <w:t>Practical DRAC debugging advice</w:t>
       </w:r>
     </w:p>
     <w:p>
@@ -1353,7 +1595,7 @@
         <w:rPr>
           <w:rFonts w:eastAsia="Calibri"/>
         </w:rPr>
-        <w:t>How to “submit a job”</w:t>
+        <w:t xml:space="preserve">DRAC technical support resources </w:t>
       </w:r>
     </w:p>
     <w:p>
@@ -1371,42 +1613,6 @@
         <w:rPr>
           <w:rFonts w:eastAsia="Calibri"/>
         </w:rPr>
-        <w:t>How to check on the status of your job</w:t>
-      </w:r>
-    </w:p>
-    <w:p>
-      <w:pPr>
-        <w:numPr>
-          <w:ilvl w:val="1"/>
-          <w:numId w:val="2"/>
-        </w:numPr>
-        <w:spacing w:line="360" w:lineRule="auto"/>
-        <w:rPr>
-          <w:rFonts w:eastAsia="Calibri"/>
-        </w:rPr>
-      </w:pPr>
-      <w:r>
-        <w:rPr>
-          <w:rFonts w:eastAsia="Calibri"/>
-        </w:rPr>
-        <w:t>How to interpret output files and error messages</w:t>
-      </w:r>
-    </w:p>
-    <w:p>
-      <w:pPr>
-        <w:numPr>
-          <w:ilvl w:val="1"/>
-          <w:numId w:val="2"/>
-        </w:numPr>
-        <w:spacing w:line="360" w:lineRule="auto"/>
-        <w:rPr>
-          <w:rFonts w:eastAsia="Calibri"/>
-        </w:rPr>
-      </w:pPr>
-      <w:r>
-        <w:rPr>
-          <w:rFonts w:eastAsia="Calibri"/>
-        </w:rPr>
         <w:t>Hands-on activity</w:t>
       </w:r>
       <w:r>
@@ -1419,278 +1625,12 @@
         <w:rPr>
           <w:rFonts w:eastAsia="Calibri"/>
         </w:rPr>
-        <w:t xml:space="preserve">Submit a job, interpret output, address error </w:t>
-      </w:r>
-      <w:r>
-        <w:rPr>
-          <w:rFonts w:eastAsia="Calibri"/>
-        </w:rPr>
-        <w:t>(</w:t>
-      </w:r>
-      <w:r>
-        <w:rPr>
-          <w:rFonts w:eastAsia="Calibri"/>
-        </w:rPr>
-        <w:t>20</w:t>
-      </w:r>
-      <w:r>
-        <w:rPr>
-          <w:rFonts w:eastAsia="Calibri"/>
-        </w:rPr>
-        <w:t>min</w:t>
-      </w:r>
-      <w:r>
-        <w:rPr>
-          <w:rFonts w:eastAsia="Calibri"/>
-        </w:rPr>
-        <w:t>)</w:t>
-      </w:r>
-    </w:p>
-    <w:p>
-      <w:pPr>
-        <w:spacing w:line="360" w:lineRule="auto"/>
-        <w:rPr>
-          <w:rFonts w:eastAsia="Calibri"/>
-        </w:rPr>
-      </w:pPr>
-    </w:p>
-    <w:p>
-      <w:pPr>
-        <w:numPr>
-          <w:ilvl w:val="0"/>
-          <w:numId w:val="2"/>
-        </w:numPr>
-        <w:spacing w:line="360" w:lineRule="auto"/>
-        <w:rPr>
-          <w:rFonts w:eastAsia="Calibri"/>
-        </w:rPr>
-      </w:pPr>
-      <w:r>
-        <w:rPr>
-          <w:rFonts w:eastAsia="Calibri"/>
-          <w:b/>
-          <w:bCs/>
-        </w:rPr>
-        <w:t xml:space="preserve">Module </w:t>
-      </w:r>
-      <w:r>
-        <w:rPr>
-          <w:rFonts w:eastAsia="Calibri"/>
-          <w:b/>
-          <w:bCs/>
-        </w:rPr>
-        <w:t xml:space="preserve">V: </w:t>
-      </w:r>
-      <w:r>
-        <w:rPr>
-          <w:rFonts w:eastAsia="Calibri"/>
-          <w:b/>
-          <w:bCs/>
-        </w:rPr>
-        <w:t xml:space="preserve">Optimizing your code for </w:t>
-      </w:r>
-      <w:bookmarkStart w:id="0" w:name="_Hlk235200506"/>
-      <w:r>
-        <w:rPr>
-          <w:rFonts w:eastAsia="Calibri"/>
-          <w:b/>
-          <w:bCs/>
-        </w:rPr>
-        <w:t>high-performance computing</w:t>
-      </w:r>
-      <w:bookmarkEnd w:id="0"/>
-      <w:r>
-        <w:rPr>
-          <w:rFonts w:eastAsia="Calibri"/>
-          <w:b/>
-          <w:bCs/>
-        </w:rPr>
-        <w:t xml:space="preserve"> </w:t>
-      </w:r>
-      <w:r>
-        <w:rPr>
-          <w:rFonts w:eastAsia="Calibri"/>
-          <w:b/>
-          <w:bCs/>
-        </w:rPr>
-        <w:t>(</w:t>
-      </w:r>
-      <w:r>
-        <w:rPr>
-          <w:rFonts w:eastAsia="Calibri"/>
-          <w:b/>
-          <w:bCs/>
-        </w:rPr>
-        <w:t>30min</w:t>
-      </w:r>
-      <w:r>
-        <w:rPr>
-          <w:rFonts w:eastAsia="Calibri"/>
-          <w:b/>
-          <w:bCs/>
-        </w:rPr>
-        <w:t>)</w:t>
-      </w:r>
-      <w:r>
-        <w:rPr>
-          <w:rFonts w:eastAsia="Calibri"/>
-        </w:rPr>
-        <w:t xml:space="preserve"> </w:t>
-      </w:r>
-    </w:p>
-    <w:p>
-      <w:pPr>
-        <w:numPr>
-          <w:ilvl w:val="1"/>
-          <w:numId w:val="2"/>
-        </w:numPr>
-        <w:spacing w:line="360" w:lineRule="auto"/>
-        <w:rPr>
-          <w:rFonts w:eastAsia="Calibri"/>
-        </w:rPr>
-      </w:pPr>
-      <w:r>
-        <w:rPr>
-          <w:rFonts w:eastAsia="Calibri"/>
-        </w:rPr>
-        <w:t xml:space="preserve">Overview of DRAC </w:t>
-      </w:r>
-      <w:r>
-        <w:rPr>
-          <w:rFonts w:eastAsia="Calibri"/>
-        </w:rPr>
-        <w:t>high-performance computing</w:t>
-      </w:r>
-      <w:r>
-        <w:rPr>
-          <w:rFonts w:eastAsia="Calibri"/>
-        </w:rPr>
-        <w:t xml:space="preserve"> </w:t>
-      </w:r>
-      <w:r>
-        <w:rPr>
-          <w:rFonts w:eastAsia="Calibri"/>
-        </w:rPr>
-        <w:t xml:space="preserve">clusters </w:t>
-      </w:r>
-    </w:p>
-    <w:p>
-      <w:pPr>
-        <w:numPr>
-          <w:ilvl w:val="2"/>
-          <w:numId w:val="2"/>
-        </w:numPr>
-        <w:spacing w:line="360" w:lineRule="auto"/>
-        <w:rPr>
-          <w:rFonts w:eastAsia="Calibri"/>
-        </w:rPr>
-      </w:pPr>
-      <w:r>
-        <w:rPr>
-          <w:rFonts w:eastAsia="Calibri"/>
-        </w:rPr>
-        <w:t>How to choose the best</w:t>
-      </w:r>
-      <w:r>
-        <w:rPr>
-          <w:rFonts w:eastAsia="Calibri"/>
-        </w:rPr>
-        <w:t xml:space="preserve"> cluster for your specific computational needs</w:t>
-      </w:r>
-    </w:p>
-    <w:p>
-      <w:pPr>
-        <w:numPr>
-          <w:ilvl w:val="1"/>
-          <w:numId w:val="2"/>
-        </w:numPr>
-        <w:spacing w:line="360" w:lineRule="auto"/>
-        <w:rPr>
-          <w:rFonts w:eastAsia="Calibri"/>
-        </w:rPr>
-      </w:pPr>
-      <w:r>
-        <w:rPr>
-          <w:rFonts w:eastAsia="Calibri"/>
-        </w:rPr>
-        <w:t>Submitting multiple jobs</w:t>
-      </w:r>
-    </w:p>
-    <w:p>
-      <w:pPr>
-        <w:numPr>
-          <w:ilvl w:val="2"/>
-          <w:numId w:val="2"/>
-        </w:numPr>
-        <w:spacing w:line="360" w:lineRule="auto"/>
-        <w:rPr>
-          <w:rFonts w:eastAsia="Calibri"/>
-        </w:rPr>
-      </w:pPr>
-      <w:r>
-        <w:rPr>
-          <w:rFonts w:eastAsia="Calibri"/>
-        </w:rPr>
-        <w:t xml:space="preserve">Introduction to bash scripting and </w:t>
-      </w:r>
-      <w:r>
-        <w:rPr>
-          <w:rFonts w:eastAsia="Calibri"/>
-        </w:rPr>
-        <w:t>parameter variables</w:t>
-      </w:r>
-    </w:p>
-    <w:p>
-      <w:pPr>
-        <w:numPr>
-          <w:ilvl w:val="1"/>
-          <w:numId w:val="2"/>
-        </w:numPr>
-        <w:spacing w:line="360" w:lineRule="auto"/>
-        <w:rPr>
-          <w:rFonts w:eastAsia="Calibri"/>
-        </w:rPr>
-      </w:pPr>
-      <w:r>
-        <w:rPr>
-          <w:rFonts w:eastAsia="Calibri"/>
-        </w:rPr>
-        <w:t>Hands-on activity</w:t>
-      </w:r>
-      <w:r>
-        <w:rPr>
-          <w:rFonts w:eastAsia="Calibri"/>
-        </w:rPr>
-        <w:t xml:space="preserve">: </w:t>
-      </w:r>
-      <w:r>
-        <w:rPr>
-          <w:rFonts w:eastAsia="Calibri"/>
-        </w:rPr>
-        <w:t xml:space="preserve">Edit your code to accommodate multi-job submissions </w:t>
-      </w:r>
-      <w:r>
-        <w:rPr>
-          <w:rFonts w:eastAsia="Calibri"/>
-        </w:rPr>
-        <w:t>(</w:t>
-      </w:r>
-      <w:r>
-        <w:rPr>
-          <w:rFonts w:eastAsia="Calibri"/>
-        </w:rPr>
-        <w:t>20min</w:t>
-      </w:r>
-      <w:r>
-        <w:rPr>
-          <w:rFonts w:eastAsia="Calibri"/>
-        </w:rPr>
-        <w:t>)</w:t>
+        <w:t>Identify and address two most common errors (20min)</w:t>
       </w:r>
     </w:p>
     <w:sectPr>
-      <w:headerReference w:type="default" r:id="rId10"/>
-      <w:headerReference w:type="first" r:id="rId11"/>
+      <w:headerReference w:type="default" r:id="rId13"/>
+      <w:headerReference w:type="first" r:id="rId14"/>
       <w:pgSz w:w="11909" w:h="16834"/>
       <w:pgMar w:top="1440" w:right="1440" w:bottom="1440" w:left="1440" w:header="720" w:footer="720" w:gutter="0"/>
       <w:pgNumType w:start="1"/>
@@ -1768,6 +1708,9 @@
       <w:jc w:val="center"/>
     </w:pPr>
     <w:r>
+      <w:rPr>
+        <w:noProof/>
+      </w:rPr>
       <w:drawing>
         <wp:anchor distT="0" distB="0" distL="114300" distR="114300" simplePos="0" relativeHeight="251659264" behindDoc="0" locked="0" layoutInCell="1" allowOverlap="1" wp14:anchorId="75ADE80E" wp14:editId="7A25B4CF">
           <wp:simplePos x="0" y="0"/>
@@ -2998,6 +2941,23 @@
       <w:shd w:val="clear" w:color="auto" w:fill="E1DFDD"/>
     </w:rPr>
   </w:style>
+  <w:style w:type="paragraph" w:styleId="NormalWeb">
+    <w:name w:val="Normal (Web)"/>
+    <w:basedOn w:val="Normal"/>
+    <w:uiPriority w:val="99"/>
+    <w:semiHidden/>
+    <w:unhideWhenUsed/>
+    <w:rsid w:val="00E34D80"/>
+    <w:pPr>
+      <w:spacing w:before="100" w:beforeAutospacing="1" w:after="100" w:afterAutospacing="1" w:line="240" w:lineRule="auto"/>
+    </w:pPr>
+    <w:rPr>
+      <w:rFonts w:ascii="Times New Roman" w:eastAsia="Times New Roman" w:hAnsi="Times New Roman" w:cs="Times New Roman"/>
+      <w:sz w:val="24"/>
+      <w:szCs w:val="24"/>
+      <w:lang w:eastAsia="en-CA"/>
+    </w:rPr>
+  </w:style>
 </w:styles>
 </file>
 

</xml_diff>